<commit_message>
2. Preparación de los datos y requirements.txt
</commit_message>
<xml_diff>
--- a/reports/informe.docx
+++ b/reports/informe.docx
@@ -4,6 +4,7 @@
   <w:body>
     <w:p>
       <w:pPr>
+        <w:spacing w:line="360" w:lineRule="auto"/>
         <w:jc w:val="right"/>
         <w:rPr>
           <w:rFonts w:ascii="Times New Roman" w:hAnsi="Times New Roman" w:cs="Times New Roman"/>
@@ -13,7 +14,34 @@
         <w:rPr>
           <w:rFonts w:ascii="Times New Roman" w:hAnsi="Times New Roman" w:cs="Times New Roman"/>
         </w:rPr>
-        <w:t>Natalia Rodriguez Franco – 202610492</w:t>
+        <w:t xml:space="preserve">Natalia </w:t>
+      </w:r>
+      <w:r>
+        <w:rPr>
+          <w:rFonts w:ascii="Times New Roman" w:hAnsi="Times New Roman" w:cs="Times New Roman"/>
+        </w:rPr>
+        <w:t>Rodríguez</w:t>
+      </w:r>
+      <w:r>
+        <w:rPr>
+          <w:rFonts w:ascii="Times New Roman" w:hAnsi="Times New Roman" w:cs="Times New Roman"/>
+        </w:rPr>
+        <w:t xml:space="preserve"> Franco – 202610492</w:t>
+      </w:r>
+    </w:p>
+    <w:p>
+      <w:pPr>
+        <w:spacing w:line="360" w:lineRule="auto"/>
+        <w:jc w:val="right"/>
+        <w:rPr>
+          <w:rFonts w:ascii="Times New Roman" w:hAnsi="Times New Roman" w:cs="Times New Roman"/>
+        </w:rPr>
+      </w:pPr>
+      <w:r>
+        <w:rPr>
+          <w:rFonts w:ascii="Times New Roman" w:hAnsi="Times New Roman" w:cs="Times New Roman"/>
+        </w:rPr>
+        <w:t>Alejandro Chica Cardona - 202613881</w:t>
       </w:r>
     </w:p>
     <w:p>
@@ -21,15 +49,51 @@
         <w:pStyle w:val="Prrafodelista"/>
         <w:numPr>
           <w:ilvl w:val="0"/>
-          <w:numId w:val="1"/>
+          <w:numId w:val="5"/>
         </w:numPr>
-        <w:rPr>
-          <w:rFonts w:ascii="Times New Roman" w:hAnsi="Times New Roman" w:cs="Times New Roman"/>
-        </w:rPr>
-      </w:pPr>
-      <w:r>
-        <w:rPr>
-          <w:rFonts w:ascii="Times New Roman" w:hAnsi="Times New Roman" w:cs="Times New Roman"/>
+        <w:spacing w:line="360" w:lineRule="auto"/>
+        <w:rPr>
+          <w:rFonts w:ascii="Times New Roman" w:hAnsi="Times New Roman" w:cs="Times New Roman"/>
+          <w:b/>
+          <w:bCs/>
+        </w:rPr>
+      </w:pPr>
+      <w:r>
+        <w:rPr>
+          <w:rFonts w:ascii="Times New Roman" w:hAnsi="Times New Roman" w:cs="Times New Roman"/>
+          <w:b/>
+          <w:bCs/>
+        </w:rPr>
+        <w:t>Entendimiento del Problema</w:t>
+      </w:r>
+    </w:p>
+    <w:p>
+      <w:pPr>
+        <w:pStyle w:val="Prrafodelista"/>
+        <w:numPr>
+          <w:ilvl w:val="1"/>
+          <w:numId w:val="5"/>
+        </w:numPr>
+        <w:spacing w:line="360" w:lineRule="auto"/>
+        <w:rPr>
+          <w:rFonts w:ascii="Times New Roman" w:hAnsi="Times New Roman" w:cs="Times New Roman"/>
+          <w:b/>
+          <w:bCs/>
+        </w:rPr>
+      </w:pPr>
+      <w:r>
+        <w:rPr>
+          <w:rFonts w:ascii="Times New Roman" w:hAnsi="Times New Roman" w:cs="Times New Roman"/>
+          <w:b/>
+          <w:bCs/>
+        </w:rPr>
+        <w:t xml:space="preserve"> </w:t>
+      </w:r>
+      <w:r>
+        <w:rPr>
+          <w:rFonts w:ascii="Times New Roman" w:hAnsi="Times New Roman" w:cs="Times New Roman"/>
+          <w:b/>
+          <w:bCs/>
         </w:rPr>
         <w:t>Comprensión del problema:</w:t>
       </w:r>
@@ -41,6 +105,7 @@
           <w:ilvl w:val="0"/>
           <w:numId w:val="2"/>
         </w:numPr>
+        <w:spacing w:line="360" w:lineRule="auto"/>
         <w:rPr>
           <w:rFonts w:ascii="Times New Roman" w:hAnsi="Times New Roman" w:cs="Times New Roman"/>
         </w:rPr>
@@ -74,6 +139,12 @@
           <w:rFonts w:ascii="Times New Roman" w:hAnsi="Times New Roman" w:cs="Times New Roman"/>
         </w:rPr>
         <w:t>en los últimos 12 meses y la alcaldía de Bogotá</w:t>
+      </w:r>
+      <w:r>
+        <w:rPr>
+          <w:rFonts w:ascii="Times New Roman" w:hAnsi="Times New Roman" w:cs="Times New Roman"/>
+        </w:rPr>
+        <w:t>.</w:t>
       </w:r>
     </w:p>
     <w:p>
@@ -83,6 +154,7 @@
           <w:ilvl w:val="0"/>
           <w:numId w:val="2"/>
         </w:numPr>
+        <w:spacing w:line="360" w:lineRule="auto"/>
         <w:rPr>
           <w:rFonts w:ascii="Times New Roman" w:hAnsi="Times New Roman" w:cs="Times New Roman"/>
         </w:rPr>
@@ -151,6 +223,7 @@
           <w:ilvl w:val="0"/>
           <w:numId w:val="2"/>
         </w:numPr>
+        <w:spacing w:line="360" w:lineRule="auto"/>
         <w:rPr>
           <w:rFonts w:ascii="Times New Roman" w:hAnsi="Times New Roman" w:cs="Times New Roman"/>
         </w:rPr>
@@ -174,6 +247,12 @@
           <w:rFonts w:ascii="Times New Roman" w:hAnsi="Times New Roman" w:cs="Times New Roman"/>
         </w:rPr>
         <w:t>Bogotá</w:t>
+      </w:r>
+      <w:r>
+        <w:rPr>
+          <w:rFonts w:ascii="Times New Roman" w:hAnsi="Times New Roman" w:cs="Times New Roman"/>
+        </w:rPr>
+        <w:t>.</w:t>
       </w:r>
     </w:p>
     <w:p>
@@ -183,6 +262,7 @@
           <w:ilvl w:val="0"/>
           <w:numId w:val="2"/>
         </w:numPr>
+        <w:spacing w:line="360" w:lineRule="auto"/>
         <w:rPr>
           <w:rFonts w:ascii="Times New Roman" w:hAnsi="Times New Roman" w:cs="Times New Roman"/>
         </w:rPr>
@@ -206,6 +286,12 @@
           <w:rFonts w:ascii="Times New Roman" w:hAnsi="Times New Roman" w:cs="Times New Roman"/>
         </w:rPr>
         <w:t>Últimos 12 meses</w:t>
+      </w:r>
+      <w:r>
+        <w:rPr>
+          <w:rFonts w:ascii="Times New Roman" w:hAnsi="Times New Roman" w:cs="Times New Roman"/>
+        </w:rPr>
+        <w:t>.</w:t>
       </w:r>
     </w:p>
     <w:p>
@@ -215,6 +301,7 @@
           <w:ilvl w:val="0"/>
           <w:numId w:val="2"/>
         </w:numPr>
+        <w:spacing w:line="360" w:lineRule="auto"/>
         <w:rPr>
           <w:rFonts w:ascii="Times New Roman" w:hAnsi="Times New Roman" w:cs="Times New Roman"/>
         </w:rPr>
@@ -247,13 +334,7 @@
         <w:rPr>
           <w:rFonts w:ascii="Times New Roman" w:hAnsi="Times New Roman" w:cs="Times New Roman"/>
         </w:rPr>
-        <w:t>características</w:t>
-      </w:r>
-      <w:r>
-        <w:rPr>
-          <w:rFonts w:ascii="Times New Roman" w:hAnsi="Times New Roman" w:cs="Times New Roman"/>
-        </w:rPr>
-        <w:t>, diferencias y patrones que puedan aportar elementos para comprender mejor</w:t>
+        <w:t>características, diferencias y patrones que puedan aportar elementos para comprender mejor</w:t>
       </w:r>
       <w:r>
         <w:rPr>
@@ -265,19 +346,7 @@
         <w:rPr>
           <w:rFonts w:ascii="Times New Roman" w:hAnsi="Times New Roman" w:cs="Times New Roman"/>
         </w:rPr>
-        <w:t xml:space="preserve">la </w:t>
-      </w:r>
-      <w:r>
-        <w:rPr>
-          <w:rFonts w:ascii="Times New Roman" w:hAnsi="Times New Roman" w:cs="Times New Roman"/>
-        </w:rPr>
-        <w:t>situación</w:t>
-      </w:r>
-      <w:r>
-        <w:rPr>
-          <w:rFonts w:ascii="Times New Roman" w:hAnsi="Times New Roman" w:cs="Times New Roman"/>
-        </w:rPr>
-        <w:t xml:space="preserve"> de la</w:t>
+        <w:t>la situación de la</w:t>
       </w:r>
       <w:r>
         <w:rPr>
@@ -289,13 +358,7 @@
         <w:rPr>
           <w:rFonts w:ascii="Times New Roman" w:hAnsi="Times New Roman" w:cs="Times New Roman"/>
         </w:rPr>
-        <w:t>población</w:t>
-      </w:r>
-      <w:r>
-        <w:rPr>
-          <w:rFonts w:ascii="Times New Roman" w:hAnsi="Times New Roman" w:cs="Times New Roman"/>
-        </w:rPr>
-        <w:t xml:space="preserve"> estudiada</w:t>
+        <w:t>población estudiada</w:t>
       </w:r>
       <w:r>
         <w:rPr>
@@ -306,15 +369,37 @@
     </w:p>
     <w:p>
       <w:pPr>
-        <w:rPr>
-          <w:rFonts w:ascii="Times New Roman" w:hAnsi="Times New Roman" w:cs="Times New Roman"/>
-        </w:rPr>
-      </w:pPr>
-      <w:r>
-        <w:rPr>
-          <w:rFonts w:ascii="Times New Roman" w:hAnsi="Times New Roman" w:cs="Times New Roman"/>
-        </w:rPr>
-        <w:t xml:space="preserve">Objetivo de negocio: </w:t>
+        <w:pStyle w:val="Prrafodelista"/>
+        <w:numPr>
+          <w:ilvl w:val="1"/>
+          <w:numId w:val="5"/>
+        </w:numPr>
+        <w:spacing w:line="360" w:lineRule="auto"/>
+        <w:rPr>
+          <w:rFonts w:ascii="Times New Roman" w:hAnsi="Times New Roman" w:cs="Times New Roman"/>
+        </w:rPr>
+      </w:pPr>
+      <w:r>
+        <w:rPr>
+          <w:rFonts w:ascii="Times New Roman" w:hAnsi="Times New Roman" w:cs="Times New Roman"/>
+          <w:b/>
+          <w:bCs/>
+        </w:rPr>
+        <w:t xml:space="preserve"> </w:t>
+      </w:r>
+      <w:r>
+        <w:rPr>
+          <w:rFonts w:ascii="Times New Roman" w:hAnsi="Times New Roman" w:cs="Times New Roman"/>
+          <w:b/>
+          <w:bCs/>
+        </w:rPr>
+        <w:t>Objetivo de negocio:</w:t>
+      </w:r>
+      <w:r>
+        <w:rPr>
+          <w:rFonts w:ascii="Times New Roman" w:hAnsi="Times New Roman" w:cs="Times New Roman"/>
+        </w:rPr>
+        <w:t xml:space="preserve"> </w:t>
       </w:r>
       <w:r>
         <w:rPr>
@@ -343,27 +428,43 @@
     </w:p>
     <w:p>
       <w:pPr>
-        <w:rPr>
-          <w:rFonts w:ascii="Times New Roman" w:hAnsi="Times New Roman" w:cs="Times New Roman"/>
-        </w:rPr>
-      </w:pPr>
-      <w:r>
-        <w:rPr>
-          <w:rFonts w:ascii="Times New Roman" w:hAnsi="Times New Roman" w:cs="Times New Roman"/>
-        </w:rPr>
-        <w:t xml:space="preserve">Pregunta cuantitativa: </w:t>
-      </w:r>
-      <w:r>
-        <w:rPr>
-          <w:rFonts w:ascii="Times New Roman" w:hAnsi="Times New Roman" w:cs="Times New Roman"/>
-        </w:rPr>
-        <w:t>¿Cómo varía el nivel de satisfacción con l</w:t>
-      </w:r>
-      <w:r>
-        <w:rPr>
-          <w:rFonts w:ascii="Times New Roman" w:hAnsi="Times New Roman" w:cs="Times New Roman"/>
-        </w:rPr>
-        <w:t xml:space="preserve">a </w:t>
+        <w:pStyle w:val="Prrafodelista"/>
+        <w:numPr>
+          <w:ilvl w:val="1"/>
+          <w:numId w:val="5"/>
+        </w:numPr>
+        <w:spacing w:line="360" w:lineRule="auto"/>
+        <w:rPr>
+          <w:rFonts w:ascii="Times New Roman" w:hAnsi="Times New Roman" w:cs="Times New Roman"/>
+        </w:rPr>
+      </w:pPr>
+      <w:r>
+        <w:rPr>
+          <w:rFonts w:ascii="Times New Roman" w:hAnsi="Times New Roman" w:cs="Times New Roman"/>
+          <w:b/>
+          <w:bCs/>
+        </w:rPr>
+        <w:t xml:space="preserve"> </w:t>
+      </w:r>
+      <w:r>
+        <w:rPr>
+          <w:rFonts w:ascii="Times New Roman" w:hAnsi="Times New Roman" w:cs="Times New Roman"/>
+          <w:b/>
+          <w:bCs/>
+        </w:rPr>
+        <w:t>Pregunta cuantitativa:</w:t>
+      </w:r>
+      <w:r>
+        <w:rPr>
+          <w:rFonts w:ascii="Times New Roman" w:hAnsi="Times New Roman" w:cs="Times New Roman"/>
+        </w:rPr>
+        <w:t xml:space="preserve"> </w:t>
+      </w:r>
+      <w:r>
+        <w:rPr>
+          <w:rFonts w:ascii="Times New Roman" w:hAnsi="Times New Roman" w:cs="Times New Roman"/>
+        </w:rPr>
+        <w:t xml:space="preserve">¿Cómo varía el nivel de satisfacción con la </w:t>
       </w:r>
       <w:r>
         <w:rPr>
@@ -375,36 +476,44 @@
         <w:rPr>
           <w:rFonts w:ascii="Times New Roman" w:hAnsi="Times New Roman" w:cs="Times New Roman"/>
         </w:rPr>
-        <w:t xml:space="preserve">entre los diferentes </w:t>
-      </w:r>
-      <w:r>
-        <w:rPr>
-          <w:rFonts w:ascii="Times New Roman" w:hAnsi="Times New Roman" w:cs="Times New Roman"/>
-        </w:rPr>
-        <w:t>grupos de edades</w:t>
-      </w:r>
-      <w:r>
-        <w:rPr>
-          <w:rFonts w:ascii="Times New Roman" w:hAnsi="Times New Roman" w:cs="Times New Roman"/>
-        </w:rPr>
-        <w:t xml:space="preserve"> de la población adulta de Bogotá? </w:t>
+        <w:t xml:space="preserve">entre los diferentes grupos de edades de la población adulta de Bogotá? </w:t>
       </w:r>
     </w:p>
     <w:p>
       <w:pPr>
-        <w:rPr>
-          <w:rFonts w:ascii="Times New Roman" w:hAnsi="Times New Roman" w:cs="Times New Roman"/>
-        </w:rPr>
-      </w:pPr>
-      <w:r>
-        <w:rPr>
-          <w:rFonts w:ascii="Times New Roman" w:hAnsi="Times New Roman" w:cs="Times New Roman"/>
+        <w:pStyle w:val="Prrafodelista"/>
+        <w:numPr>
+          <w:ilvl w:val="1"/>
+          <w:numId w:val="5"/>
+        </w:numPr>
+        <w:spacing w:line="360" w:lineRule="auto"/>
+        <w:rPr>
+          <w:rFonts w:ascii="Times New Roman" w:hAnsi="Times New Roman" w:cs="Times New Roman"/>
+          <w:b/>
+          <w:bCs/>
+        </w:rPr>
+      </w:pPr>
+      <w:r>
+        <w:rPr>
+          <w:rFonts w:ascii="Times New Roman" w:hAnsi="Times New Roman" w:cs="Times New Roman"/>
+          <w:b/>
+          <w:bCs/>
+        </w:rPr>
+        <w:t xml:space="preserve"> </w:t>
+      </w:r>
+      <w:r>
+        <w:rPr>
+          <w:rFonts w:ascii="Times New Roman" w:hAnsi="Times New Roman" w:cs="Times New Roman"/>
+          <w:b/>
+          <w:bCs/>
         </w:rPr>
         <w:t xml:space="preserve">Antes de consultar la base de datos, </w:t>
       </w:r>
       <w:r>
         <w:rPr>
           <w:rFonts w:ascii="Times New Roman" w:hAnsi="Times New Roman" w:cs="Times New Roman"/>
+          <w:b/>
+          <w:bCs/>
         </w:rPr>
         <w:t xml:space="preserve">se requeriría la siguiente información: </w:t>
       </w:r>
@@ -416,6 +525,7 @@
           <w:ilvl w:val="0"/>
           <w:numId w:val="2"/>
         </w:numPr>
+        <w:spacing w:line="360" w:lineRule="auto"/>
         <w:rPr>
           <w:rFonts w:ascii="Times New Roman" w:hAnsi="Times New Roman" w:cs="Times New Roman"/>
         </w:rPr>
@@ -440,6 +550,7 @@
           <w:ilvl w:val="0"/>
           <w:numId w:val="2"/>
         </w:numPr>
+        <w:spacing w:line="360" w:lineRule="auto"/>
         <w:rPr>
           <w:rFonts w:ascii="Times New Roman" w:hAnsi="Times New Roman" w:cs="Times New Roman"/>
         </w:rPr>
@@ -460,13 +571,7 @@
         <w:rPr>
           <w:rFonts w:ascii="Times New Roman" w:hAnsi="Times New Roman" w:cs="Times New Roman"/>
         </w:rPr>
-        <w:t xml:space="preserve">, y </w:t>
-      </w:r>
-      <w:r>
-        <w:rPr>
-          <w:rFonts w:ascii="Times New Roman" w:hAnsi="Times New Roman" w:cs="Times New Roman"/>
-        </w:rPr>
-        <w:t xml:space="preserve">dividir la población por grupos de edades (Variable numérica discreta). O bien una variable que clasifique por grupos de edades. </w:t>
+        <w:t xml:space="preserve">, y dividir la población por grupos de edades (Variable numérica discreta). O bien una variable que clasifique por grupos de edades. </w:t>
       </w:r>
     </w:p>
     <w:p>
@@ -476,6 +581,7 @@
           <w:ilvl w:val="0"/>
           <w:numId w:val="2"/>
         </w:numPr>
+        <w:spacing w:line="360" w:lineRule="auto"/>
         <w:rPr>
           <w:rFonts w:ascii="Times New Roman" w:hAnsi="Times New Roman" w:cs="Times New Roman"/>
         </w:rPr>
@@ -495,8 +601,7 @@
     </w:p>
     <w:p>
       <w:pPr>
-        <w:pStyle w:val="Prrafodelista"/>
-        <w:ind w:left="1080"/>
+        <w:spacing w:line="360" w:lineRule="auto"/>
         <w:rPr>
           <w:rFonts w:ascii="Times New Roman" w:hAnsi="Times New Roman" w:cs="Times New Roman"/>
         </w:rPr>
@@ -504,6 +609,7 @@
     </w:p>
     <w:p>
       <w:pPr>
+        <w:spacing w:line="360" w:lineRule="auto"/>
         <w:rPr>
           <w:rFonts w:ascii="Times New Roman" w:hAnsi="Times New Roman" w:cs="Times New Roman"/>
         </w:rPr>
@@ -511,31 +617,1164 @@
     </w:p>
     <w:p>
       <w:pPr>
-        <w:rPr>
-          <w:rFonts w:ascii="Times New Roman" w:hAnsi="Times New Roman" w:cs="Times New Roman"/>
-        </w:rPr>
-      </w:pPr>
+        <w:pStyle w:val="Prrafodelista"/>
+        <w:numPr>
+          <w:ilvl w:val="0"/>
+          <w:numId w:val="5"/>
+        </w:numPr>
+        <w:spacing w:line="360" w:lineRule="auto"/>
+        <w:rPr>
+          <w:rFonts w:ascii="Times New Roman" w:hAnsi="Times New Roman" w:cs="Times New Roman"/>
+        </w:rPr>
+      </w:pPr>
+      <w:r>
+        <w:rPr>
+          <w:rFonts w:ascii="Times New Roman" w:hAnsi="Times New Roman" w:cs="Times New Roman"/>
+          <w:b/>
+          <w:bCs/>
+        </w:rPr>
+        <w:lastRenderedPageBreak/>
+        <w:t>Preparación de los Datos</w:t>
+      </w:r>
     </w:p>
     <w:p>
       <w:pPr>
-        <w:rPr>
-          <w:rFonts w:ascii="Times New Roman" w:hAnsi="Times New Roman" w:cs="Times New Roman"/>
-        </w:rPr>
-      </w:pPr>
+        <w:pStyle w:val="Prrafodelista"/>
+        <w:numPr>
+          <w:ilvl w:val="1"/>
+          <w:numId w:val="5"/>
+        </w:numPr>
+        <w:spacing w:line="360" w:lineRule="auto"/>
+        <w:rPr>
+          <w:rFonts w:ascii="Times New Roman" w:hAnsi="Times New Roman" w:cs="Times New Roman"/>
+        </w:rPr>
+      </w:pPr>
+      <w:r>
+        <w:rPr>
+          <w:rFonts w:ascii="Times New Roman" w:hAnsi="Times New Roman" w:cs="Times New Roman"/>
+          <w:b/>
+          <w:bCs/>
+        </w:rPr>
+        <w:t xml:space="preserve"> Variables seleccionadas:</w:t>
+      </w:r>
+    </w:p>
+    <w:tbl>
+      <w:tblPr>
+        <w:tblStyle w:val="Tablaconcuadrcula"/>
+        <w:tblW w:w="4601" w:type="pct"/>
+        <w:tblInd w:w="704" w:type="dxa"/>
+        <w:tblLook w:val="04A0" w:firstRow="1" w:lastRow="0" w:firstColumn="1" w:lastColumn="0" w:noHBand="0" w:noVBand="1"/>
+      </w:tblPr>
+      <w:tblGrid>
+        <w:gridCol w:w="2101"/>
+        <w:gridCol w:w="2806"/>
+        <w:gridCol w:w="3217"/>
+      </w:tblGrid>
+      <w:tr>
+        <w:tc>
+          <w:tcPr>
+            <w:tcW w:w="1293" w:type="pct"/>
+          </w:tcPr>
+          <w:p>
+            <w:pPr>
+              <w:pStyle w:val="Prrafodelista"/>
+              <w:spacing w:line="360" w:lineRule="auto"/>
+              <w:ind w:left="0"/>
+              <w:jc w:val="center"/>
+              <w:rPr>
+                <w:rFonts w:ascii="Times New Roman" w:hAnsi="Times New Roman" w:cs="Times New Roman"/>
+                <w:b/>
+                <w:bCs/>
+              </w:rPr>
+            </w:pPr>
+            <w:r>
+              <w:rPr>
+                <w:rFonts w:ascii="Times New Roman" w:hAnsi="Times New Roman" w:cs="Times New Roman"/>
+                <w:b/>
+                <w:bCs/>
+              </w:rPr>
+              <w:t>Variable</w:t>
+            </w:r>
+          </w:p>
+        </w:tc>
+        <w:tc>
+          <w:tcPr>
+            <w:tcW w:w="1727" w:type="pct"/>
+          </w:tcPr>
+          <w:p>
+            <w:pPr>
+              <w:pStyle w:val="Prrafodelista"/>
+              <w:spacing w:line="360" w:lineRule="auto"/>
+              <w:ind w:left="0"/>
+              <w:jc w:val="center"/>
+              <w:rPr>
+                <w:rFonts w:ascii="Times New Roman" w:hAnsi="Times New Roman" w:cs="Times New Roman"/>
+                <w:b/>
+                <w:bCs/>
+              </w:rPr>
+            </w:pPr>
+            <w:r>
+              <w:rPr>
+                <w:rFonts w:ascii="Times New Roman" w:hAnsi="Times New Roman" w:cs="Times New Roman"/>
+                <w:b/>
+                <w:bCs/>
+              </w:rPr>
+              <w:t>¿Qué representa?</w:t>
+            </w:r>
+          </w:p>
+        </w:tc>
+        <w:tc>
+          <w:tcPr>
+            <w:tcW w:w="1980" w:type="pct"/>
+          </w:tcPr>
+          <w:p>
+            <w:pPr>
+              <w:pStyle w:val="Prrafodelista"/>
+              <w:spacing w:line="360" w:lineRule="auto"/>
+              <w:ind w:left="0"/>
+              <w:jc w:val="center"/>
+              <w:rPr>
+                <w:rFonts w:ascii="Times New Roman" w:hAnsi="Times New Roman" w:cs="Times New Roman"/>
+                <w:b/>
+                <w:bCs/>
+              </w:rPr>
+            </w:pPr>
+            <w:r>
+              <w:rPr>
+                <w:rFonts w:ascii="Times New Roman" w:hAnsi="Times New Roman" w:cs="Times New Roman"/>
+                <w:b/>
+                <w:bCs/>
+              </w:rPr>
+              <w:t>Tipo de dato</w:t>
+            </w:r>
+          </w:p>
+        </w:tc>
+      </w:tr>
+      <w:tr>
+        <w:tc>
+          <w:tcPr>
+            <w:tcW w:w="1293" w:type="pct"/>
+          </w:tcPr>
+          <w:p>
+            <w:pPr>
+              <w:pStyle w:val="Prrafodelista"/>
+              <w:spacing w:line="360" w:lineRule="auto"/>
+              <w:ind w:left="0"/>
+              <w:jc w:val="center"/>
+              <w:rPr>
+                <w:rFonts w:ascii="Times New Roman" w:hAnsi="Times New Roman" w:cs="Times New Roman"/>
+              </w:rPr>
+            </w:pPr>
+            <w:r>
+              <w:rPr>
+                <w:rFonts w:ascii="Times New Roman" w:hAnsi="Times New Roman" w:cs="Times New Roman"/>
+              </w:rPr>
+              <w:t>P6040</w:t>
+            </w:r>
+          </w:p>
+        </w:tc>
+        <w:tc>
+          <w:tcPr>
+            <w:tcW w:w="1727" w:type="pct"/>
+          </w:tcPr>
+          <w:p>
+            <w:pPr>
+              <w:pStyle w:val="Prrafodelista"/>
+              <w:spacing w:line="360" w:lineRule="auto"/>
+              <w:ind w:left="0"/>
+              <w:jc w:val="center"/>
+              <w:rPr>
+                <w:rFonts w:ascii="Times New Roman" w:hAnsi="Times New Roman" w:cs="Times New Roman"/>
+              </w:rPr>
+            </w:pPr>
+            <w:r>
+              <w:rPr>
+                <w:rFonts w:ascii="Times New Roman" w:hAnsi="Times New Roman" w:cs="Times New Roman"/>
+              </w:rPr>
+              <w:t>Edad</w:t>
+            </w:r>
+            <w:r>
+              <w:rPr>
+                <w:rFonts w:ascii="Times New Roman" w:hAnsi="Times New Roman" w:cs="Times New Roman"/>
+              </w:rPr>
+              <w:t xml:space="preserve"> del encuestad</w:t>
+            </w:r>
+            <w:r>
+              <w:rPr>
+                <w:rFonts w:ascii="Times New Roman" w:hAnsi="Times New Roman" w:cs="Times New Roman"/>
+              </w:rPr>
+              <w:t>o</w:t>
+            </w:r>
+          </w:p>
+        </w:tc>
+        <w:tc>
+          <w:tcPr>
+            <w:tcW w:w="1980" w:type="pct"/>
+          </w:tcPr>
+          <w:p>
+            <w:pPr>
+              <w:pStyle w:val="Prrafodelista"/>
+              <w:spacing w:line="360" w:lineRule="auto"/>
+              <w:ind w:left="0"/>
+              <w:jc w:val="center"/>
+              <w:rPr>
+                <w:rFonts w:ascii="Times New Roman" w:hAnsi="Times New Roman" w:cs="Times New Roman"/>
+              </w:rPr>
+            </w:pPr>
+            <w:r>
+              <w:rPr>
+                <w:rFonts w:ascii="Times New Roman" w:hAnsi="Times New Roman" w:cs="Times New Roman"/>
+              </w:rPr>
+              <w:t>Numérico Discreto</w:t>
+            </w:r>
+          </w:p>
+        </w:tc>
+      </w:tr>
+      <w:tr>
+        <w:tc>
+          <w:tcPr>
+            <w:tcW w:w="1293" w:type="pct"/>
+          </w:tcPr>
+          <w:p>
+            <w:pPr>
+              <w:pStyle w:val="Prrafodelista"/>
+              <w:spacing w:line="360" w:lineRule="auto"/>
+              <w:ind w:left="0"/>
+              <w:jc w:val="center"/>
+              <w:rPr>
+                <w:rFonts w:ascii="Times New Roman" w:hAnsi="Times New Roman" w:cs="Times New Roman"/>
+              </w:rPr>
+            </w:pPr>
+            <w:r>
+              <w:rPr>
+                <w:rFonts w:ascii="Times New Roman" w:hAnsi="Times New Roman" w:cs="Times New Roman"/>
+              </w:rPr>
+              <w:t>P1897</w:t>
+            </w:r>
+          </w:p>
+        </w:tc>
+        <w:tc>
+          <w:tcPr>
+            <w:tcW w:w="1727" w:type="pct"/>
+          </w:tcPr>
+          <w:p>
+            <w:pPr>
+              <w:pStyle w:val="Prrafodelista"/>
+              <w:spacing w:line="360" w:lineRule="auto"/>
+              <w:ind w:left="0"/>
+              <w:jc w:val="center"/>
+              <w:rPr>
+                <w:rFonts w:ascii="Times New Roman" w:hAnsi="Times New Roman" w:cs="Times New Roman"/>
+              </w:rPr>
+            </w:pPr>
+            <w:r>
+              <w:rPr>
+                <w:rFonts w:ascii="Times New Roman" w:hAnsi="Times New Roman" w:cs="Times New Roman"/>
+              </w:rPr>
+              <w:t xml:space="preserve">Nivel de satisfacción </w:t>
+            </w:r>
+            <w:r>
+              <w:rPr>
+                <w:rFonts w:ascii="Times New Roman" w:hAnsi="Times New Roman" w:cs="Times New Roman"/>
+              </w:rPr>
+              <w:t>con su salud actual</w:t>
+            </w:r>
+          </w:p>
+        </w:tc>
+        <w:tc>
+          <w:tcPr>
+            <w:tcW w:w="1980" w:type="pct"/>
+          </w:tcPr>
+          <w:p>
+            <w:pPr>
+              <w:pStyle w:val="Prrafodelista"/>
+              <w:spacing w:line="360" w:lineRule="auto"/>
+              <w:ind w:left="0"/>
+              <w:jc w:val="center"/>
+              <w:rPr>
+                <w:rFonts w:ascii="Times New Roman" w:hAnsi="Times New Roman" w:cs="Times New Roman"/>
+              </w:rPr>
+            </w:pPr>
+            <w:r>
+              <w:rPr>
+                <w:rFonts w:ascii="Times New Roman" w:hAnsi="Times New Roman" w:cs="Times New Roman"/>
+              </w:rPr>
+              <w:t>C</w:t>
+            </w:r>
+            <w:r>
+              <w:rPr>
+                <w:rFonts w:ascii="Times New Roman" w:hAnsi="Times New Roman" w:cs="Times New Roman"/>
+              </w:rPr>
+              <w:t>ategórico</w:t>
+            </w:r>
+            <w:r>
+              <w:rPr>
+                <w:rFonts w:ascii="Times New Roman" w:hAnsi="Times New Roman" w:cs="Times New Roman"/>
+              </w:rPr>
+              <w:t xml:space="preserve"> </w:t>
+            </w:r>
+            <w:r>
+              <w:rPr>
+                <w:rFonts w:ascii="Times New Roman" w:hAnsi="Times New Roman" w:cs="Times New Roman"/>
+              </w:rPr>
+              <w:t>Ordinal</w:t>
+            </w:r>
+          </w:p>
+        </w:tc>
+      </w:tr>
+    </w:tbl>
+    <w:p>
+      <w:pPr>
+        <w:spacing w:line="360" w:lineRule="auto"/>
+        <w:ind w:left="643"/>
+        <w:jc w:val="both"/>
+        <w:rPr>
+          <w:rFonts w:ascii="Times New Roman" w:hAnsi="Times New Roman" w:cs="Times New Roman"/>
+        </w:rPr>
+      </w:pPr>
+      <w:r>
+        <w:rPr>
+          <w:rFonts w:ascii="Times New Roman" w:hAnsi="Times New Roman" w:cs="Times New Roman"/>
+          <w:b/>
+          <w:bCs/>
+        </w:rPr>
+        <w:t xml:space="preserve">Observación: </w:t>
+      </w:r>
+      <w:r>
+        <w:rPr>
+          <w:rFonts w:ascii="Times New Roman" w:hAnsi="Times New Roman" w:cs="Times New Roman"/>
+        </w:rPr>
+        <w:t>Al explorar las variables disponibles para identificar la residencia en Bogotá durante los últimos 12 meses, se encontró que la única variable relacionada (</w:t>
+      </w:r>
+      <w:r>
+        <w:rPr>
+          <w:rFonts w:ascii="Times New Roman" w:hAnsi="Times New Roman" w:cs="Times New Roman"/>
+        </w:rPr>
+        <w:t>P</w:t>
+      </w:r>
+      <w:r>
+        <w:rPr>
+          <w:rFonts w:ascii="Times New Roman" w:hAnsi="Times New Roman" w:cs="Times New Roman"/>
+        </w:rPr>
+        <w:t>753S2) corresponde a una pregunta que solo aplica a personas que reportaron un cambio de municipio</w:t>
+      </w:r>
+      <w:r>
+        <w:rPr>
+          <w:rFonts w:ascii="Times New Roman" w:hAnsi="Times New Roman" w:cs="Times New Roman"/>
+        </w:rPr>
+        <w:t xml:space="preserve"> de residencia</w:t>
+      </w:r>
+      <w:r>
+        <w:rPr>
+          <w:rFonts w:ascii="Times New Roman" w:hAnsi="Times New Roman" w:cs="Times New Roman"/>
+        </w:rPr>
+        <w:t xml:space="preserve">, por lo que su uso como filtro reduce la muestra a </w:t>
+      </w:r>
+      <w:r>
+        <w:rPr>
+          <w:rFonts w:ascii="Times New Roman" w:hAnsi="Times New Roman" w:cs="Times New Roman"/>
+        </w:rPr>
+        <w:t xml:space="preserve">tan solo </w:t>
+      </w:r>
+      <w:r>
+        <w:rPr>
+          <w:rFonts w:ascii="Times New Roman" w:hAnsi="Times New Roman" w:cs="Times New Roman"/>
+        </w:rPr>
+        <w:t>253 registros</w:t>
+      </w:r>
+      <w:r>
+        <w:rPr>
+          <w:rFonts w:ascii="Times New Roman" w:hAnsi="Times New Roman" w:cs="Times New Roman"/>
+        </w:rPr>
+        <w:t xml:space="preserve">. </w:t>
+      </w:r>
+      <w:r>
+        <w:rPr>
+          <w:rFonts w:ascii="Times New Roman" w:hAnsi="Times New Roman" w:cs="Times New Roman"/>
+        </w:rPr>
+        <w:t>Ante esta limitación</w:t>
+      </w:r>
+      <w:r>
+        <w:rPr>
+          <w:rFonts w:ascii="Times New Roman" w:hAnsi="Times New Roman" w:cs="Times New Roman"/>
+        </w:rPr>
+        <w:t>, se decidió realizar</w:t>
+      </w:r>
+      <w:r>
+        <w:rPr>
+          <w:rFonts w:ascii="Times New Roman" w:hAnsi="Times New Roman" w:cs="Times New Roman"/>
+        </w:rPr>
+        <w:t xml:space="preserve"> el análisi</w:t>
+      </w:r>
+      <w:r>
+        <w:rPr>
+          <w:rFonts w:ascii="Times New Roman" w:hAnsi="Times New Roman" w:cs="Times New Roman"/>
+        </w:rPr>
+        <w:t>s</w:t>
+      </w:r>
+      <w:r>
+        <w:rPr>
+          <w:rFonts w:ascii="Times New Roman" w:hAnsi="Times New Roman" w:cs="Times New Roman"/>
+        </w:rPr>
+        <w:t xml:space="preserve"> sin aplicar el filtro geográfico de residencia </w:t>
+      </w:r>
+      <w:r>
+        <w:rPr>
+          <w:rFonts w:ascii="Times New Roman" w:hAnsi="Times New Roman" w:cs="Times New Roman"/>
+          <w:u w:val="single"/>
+        </w:rPr>
+        <w:t>en</w:t>
+      </w:r>
+      <w:r>
+        <w:rPr>
+          <w:rFonts w:ascii="Times New Roman" w:hAnsi="Times New Roman" w:cs="Times New Roman"/>
+        </w:rPr>
+        <w:t xml:space="preserve"> Bogotá, considerando únicamente el filtro de edad.</w:t>
+      </w:r>
     </w:p>
     <w:p>
       <w:pPr>
-        <w:rPr>
-          <w:rFonts w:ascii="Times New Roman" w:hAnsi="Times New Roman" w:cs="Times New Roman"/>
-        </w:rPr>
-      </w:pPr>
+        <w:pStyle w:val="Prrafodelista"/>
+        <w:numPr>
+          <w:ilvl w:val="1"/>
+          <w:numId w:val="5"/>
+        </w:numPr>
+        <w:spacing w:line="360" w:lineRule="auto"/>
+        <w:jc w:val="both"/>
+        <w:rPr>
+          <w:rFonts w:ascii="Times New Roman" w:hAnsi="Times New Roman" w:cs="Times New Roman"/>
+          <w:b/>
+          <w:bCs/>
+        </w:rPr>
+      </w:pPr>
+      <w:r>
+        <w:rPr>
+          <w:rFonts w:ascii="Times New Roman" w:hAnsi="Times New Roman" w:cs="Times New Roman"/>
+        </w:rPr>
+        <w:t xml:space="preserve"> </w:t>
+      </w:r>
+      <w:r>
+        <w:rPr>
+          <w:rFonts w:ascii="Times New Roman" w:hAnsi="Times New Roman" w:cs="Times New Roman"/>
+          <w:b/>
+          <w:bCs/>
+        </w:rPr>
+        <w:t>Filtrado de datos</w:t>
+      </w:r>
+      <w:r>
+        <w:rPr>
+          <w:rFonts w:ascii="Times New Roman" w:hAnsi="Times New Roman" w:cs="Times New Roman"/>
+          <w:b/>
+          <w:bCs/>
+        </w:rPr>
+        <w:t>:</w:t>
+      </w:r>
+      <w:r>
+        <w:rPr>
+          <w:rFonts w:ascii="Times New Roman" w:hAnsi="Times New Roman" w:cs="Times New Roman"/>
+        </w:rPr>
+        <w:t xml:space="preserve"> A</w:t>
+      </w:r>
+      <w:r>
+        <w:rPr>
+          <w:rFonts w:ascii="Times New Roman" w:hAnsi="Times New Roman" w:cs="Times New Roman"/>
+        </w:rPr>
+        <w:t>l aplicar</w:t>
+      </w:r>
+      <w:r>
+        <w:rPr>
+          <w:rFonts w:ascii="Times New Roman" w:hAnsi="Times New Roman" w:cs="Times New Roman"/>
+        </w:rPr>
+        <w:t xml:space="preserve"> el filtro de edad</w:t>
+      </w:r>
+      <w:r>
+        <w:rPr>
+          <w:rFonts w:ascii="Times New Roman" w:hAnsi="Times New Roman" w:cs="Times New Roman"/>
+        </w:rPr>
+        <w:t xml:space="preserve"> se identificó que la muestra que representa a la población con 18 </w:t>
+      </w:r>
+      <w:r>
+        <w:rPr>
+          <w:rFonts w:ascii="Times New Roman" w:hAnsi="Times New Roman" w:cs="Times New Roman"/>
+        </w:rPr>
+        <w:t>años</w:t>
+      </w:r>
+      <w:r>
+        <w:rPr>
+          <w:rFonts w:ascii="Times New Roman" w:hAnsi="Times New Roman" w:cs="Times New Roman"/>
+        </w:rPr>
+        <w:t xml:space="preserve"> o más </w:t>
+      </w:r>
+      <w:r>
+        <w:rPr>
+          <w:rFonts w:ascii="Times New Roman" w:hAnsi="Times New Roman" w:cs="Times New Roman"/>
+        </w:rPr>
+        <w:t xml:space="preserve">tiene un tamaño de 172.025 registros, equivalentes </w:t>
+      </w:r>
+      <w:r>
+        <w:rPr>
+          <w:rFonts w:ascii="Times New Roman" w:hAnsi="Times New Roman" w:cs="Times New Roman"/>
+        </w:rPr>
+        <w:t xml:space="preserve">al </w:t>
+      </w:r>
+      <w:r>
+        <w:rPr>
+          <w:rFonts w:ascii="Times New Roman" w:hAnsi="Times New Roman" w:cs="Times New Roman"/>
+        </w:rPr>
+        <w:t>73</w:t>
+      </w:r>
+      <w:r>
+        <w:rPr>
+          <w:rFonts w:ascii="Times New Roman" w:hAnsi="Times New Roman" w:cs="Times New Roman"/>
+        </w:rPr>
+        <w:t>,1% de la población total.</w:t>
+      </w:r>
     </w:p>
     <w:p>
       <w:pPr>
-        <w:rPr>
-          <w:rFonts w:ascii="Times New Roman" w:hAnsi="Times New Roman" w:cs="Times New Roman"/>
-        </w:rPr>
-      </w:pPr>
+        <w:pStyle w:val="Prrafodelista"/>
+        <w:numPr>
+          <w:ilvl w:val="1"/>
+          <w:numId w:val="5"/>
+        </w:numPr>
+        <w:spacing w:line="360" w:lineRule="auto"/>
+        <w:rPr>
+          <w:rFonts w:ascii="Times New Roman" w:hAnsi="Times New Roman" w:cs="Times New Roman"/>
+          <w:b/>
+          <w:bCs/>
+        </w:rPr>
+      </w:pPr>
+      <w:r>
+        <w:rPr>
+          <w:rFonts w:ascii="Times New Roman" w:hAnsi="Times New Roman" w:cs="Times New Roman"/>
+          <w:b/>
+          <w:bCs/>
+        </w:rPr>
+        <w:t xml:space="preserve"> Calidad de los datos:</w:t>
+      </w:r>
+    </w:p>
+    <w:tbl>
+      <w:tblPr>
+        <w:tblStyle w:val="Tablaconcuadrcula"/>
+        <w:tblW w:w="4601" w:type="pct"/>
+        <w:tblInd w:w="704" w:type="dxa"/>
+        <w:tblLook w:val="04A0" w:firstRow="1" w:lastRow="0" w:firstColumn="1" w:lastColumn="0" w:noHBand="0" w:noVBand="1"/>
+      </w:tblPr>
+      <w:tblGrid>
+        <w:gridCol w:w="1133"/>
+        <w:gridCol w:w="1986"/>
+        <w:gridCol w:w="2834"/>
+        <w:gridCol w:w="2171"/>
+      </w:tblGrid>
+      <w:tr>
+        <w:tc>
+          <w:tcPr>
+            <w:tcW w:w="697" w:type="pct"/>
+          </w:tcPr>
+          <w:p>
+            <w:pPr>
+              <w:pStyle w:val="Prrafodelista"/>
+              <w:spacing w:line="360" w:lineRule="auto"/>
+              <w:ind w:left="0"/>
+              <w:jc w:val="center"/>
+              <w:rPr>
+                <w:rFonts w:ascii="Times New Roman" w:hAnsi="Times New Roman" w:cs="Times New Roman"/>
+                <w:b/>
+                <w:bCs/>
+              </w:rPr>
+            </w:pPr>
+            <w:r>
+              <w:rPr>
+                <w:rFonts w:ascii="Times New Roman" w:hAnsi="Times New Roman" w:cs="Times New Roman"/>
+                <w:b/>
+                <w:bCs/>
+              </w:rPr>
+              <w:t>Variable</w:t>
+            </w:r>
+          </w:p>
+        </w:tc>
+        <w:tc>
+          <w:tcPr>
+            <w:tcW w:w="1222" w:type="pct"/>
+          </w:tcPr>
+          <w:p>
+            <w:pPr>
+              <w:pStyle w:val="Prrafodelista"/>
+              <w:spacing w:line="360" w:lineRule="auto"/>
+              <w:ind w:left="0"/>
+              <w:jc w:val="center"/>
+              <w:rPr>
+                <w:rFonts w:ascii="Times New Roman" w:hAnsi="Times New Roman" w:cs="Times New Roman"/>
+                <w:b/>
+                <w:bCs/>
+              </w:rPr>
+            </w:pPr>
+            <w:r>
+              <w:rPr>
+                <w:rFonts w:ascii="Times New Roman" w:hAnsi="Times New Roman" w:cs="Times New Roman"/>
+                <w:b/>
+                <w:bCs/>
+              </w:rPr>
+              <w:t>Datos válidos</w:t>
+            </w:r>
+          </w:p>
+        </w:tc>
+        <w:tc>
+          <w:tcPr>
+            <w:tcW w:w="1744" w:type="pct"/>
+          </w:tcPr>
+          <w:p>
+            <w:pPr>
+              <w:pStyle w:val="Prrafodelista"/>
+              <w:spacing w:line="360" w:lineRule="auto"/>
+              <w:ind w:left="0"/>
+              <w:jc w:val="center"/>
+              <w:rPr>
+                <w:rFonts w:ascii="Times New Roman" w:hAnsi="Times New Roman" w:cs="Times New Roman"/>
+                <w:b/>
+                <w:bCs/>
+              </w:rPr>
+            </w:pPr>
+            <w:r>
+              <w:rPr>
+                <w:rFonts w:ascii="Times New Roman" w:hAnsi="Times New Roman" w:cs="Times New Roman"/>
+                <w:b/>
+                <w:bCs/>
+              </w:rPr>
+              <w:t>Datos faltantes / nulos</w:t>
+            </w:r>
+          </w:p>
+        </w:tc>
+        <w:tc>
+          <w:tcPr>
+            <w:tcW w:w="1336" w:type="pct"/>
+          </w:tcPr>
+          <w:p>
+            <w:pPr>
+              <w:pStyle w:val="Prrafodelista"/>
+              <w:spacing w:line="360" w:lineRule="auto"/>
+              <w:ind w:left="0"/>
+              <w:jc w:val="center"/>
+              <w:rPr>
+                <w:rFonts w:ascii="Times New Roman" w:hAnsi="Times New Roman" w:cs="Times New Roman"/>
+                <w:b/>
+                <w:bCs/>
+              </w:rPr>
+            </w:pPr>
+            <w:r>
+              <w:rPr>
+                <w:rFonts w:ascii="Times New Roman" w:hAnsi="Times New Roman" w:cs="Times New Roman"/>
+                <w:b/>
+                <w:bCs/>
+              </w:rPr>
+              <w:t>% de datos nulos</w:t>
+            </w:r>
+          </w:p>
+        </w:tc>
+      </w:tr>
+      <w:tr>
+        <w:tc>
+          <w:tcPr>
+            <w:tcW w:w="697" w:type="pct"/>
+          </w:tcPr>
+          <w:p>
+            <w:pPr>
+              <w:pStyle w:val="Prrafodelista"/>
+              <w:spacing w:line="360" w:lineRule="auto"/>
+              <w:ind w:left="0"/>
+              <w:jc w:val="center"/>
+              <w:rPr>
+                <w:rFonts w:ascii="Times New Roman" w:hAnsi="Times New Roman" w:cs="Times New Roman"/>
+              </w:rPr>
+            </w:pPr>
+            <w:r>
+              <w:rPr>
+                <w:rFonts w:ascii="Times New Roman" w:hAnsi="Times New Roman" w:cs="Times New Roman"/>
+              </w:rPr>
+              <w:t>P6040</w:t>
+            </w:r>
+          </w:p>
+        </w:tc>
+        <w:tc>
+          <w:tcPr>
+            <w:tcW w:w="1222" w:type="pct"/>
+          </w:tcPr>
+          <w:p>
+            <w:pPr>
+              <w:pStyle w:val="Prrafodelista"/>
+              <w:spacing w:line="360" w:lineRule="auto"/>
+              <w:ind w:left="0"/>
+              <w:jc w:val="center"/>
+              <w:rPr>
+                <w:rFonts w:ascii="Times New Roman" w:hAnsi="Times New Roman" w:cs="Times New Roman"/>
+              </w:rPr>
+            </w:pPr>
+            <w:r>
+              <w:rPr>
+                <w:rFonts w:ascii="Times New Roman" w:hAnsi="Times New Roman" w:cs="Times New Roman"/>
+              </w:rPr>
+              <w:t>172</w:t>
+            </w:r>
+            <w:r>
+              <w:rPr>
+                <w:rFonts w:ascii="Times New Roman" w:hAnsi="Times New Roman" w:cs="Times New Roman"/>
+              </w:rPr>
+              <w:t>.</w:t>
+            </w:r>
+            <w:r>
+              <w:rPr>
+                <w:rFonts w:ascii="Times New Roman" w:hAnsi="Times New Roman" w:cs="Times New Roman"/>
+              </w:rPr>
+              <w:t>025</w:t>
+            </w:r>
+          </w:p>
+        </w:tc>
+        <w:tc>
+          <w:tcPr>
+            <w:tcW w:w="1744" w:type="pct"/>
+          </w:tcPr>
+          <w:p>
+            <w:pPr>
+              <w:pStyle w:val="Prrafodelista"/>
+              <w:spacing w:line="360" w:lineRule="auto"/>
+              <w:ind w:left="0"/>
+              <w:jc w:val="center"/>
+              <w:rPr>
+                <w:rFonts w:ascii="Times New Roman" w:hAnsi="Times New Roman" w:cs="Times New Roman"/>
+              </w:rPr>
+            </w:pPr>
+            <w:r>
+              <w:rPr>
+                <w:rFonts w:ascii="Times New Roman" w:hAnsi="Times New Roman" w:cs="Times New Roman"/>
+              </w:rPr>
+              <w:t>0</w:t>
+            </w:r>
+          </w:p>
+        </w:tc>
+        <w:tc>
+          <w:tcPr>
+            <w:tcW w:w="1336" w:type="pct"/>
+          </w:tcPr>
+          <w:p>
+            <w:pPr>
+              <w:pStyle w:val="Prrafodelista"/>
+              <w:spacing w:line="360" w:lineRule="auto"/>
+              <w:ind w:left="0"/>
+              <w:jc w:val="center"/>
+              <w:rPr>
+                <w:rFonts w:ascii="Times New Roman" w:hAnsi="Times New Roman" w:cs="Times New Roman"/>
+              </w:rPr>
+            </w:pPr>
+            <w:r>
+              <w:rPr>
+                <w:rFonts w:ascii="Times New Roman" w:hAnsi="Times New Roman" w:cs="Times New Roman"/>
+              </w:rPr>
+              <w:t>0</w:t>
+            </w:r>
+          </w:p>
+        </w:tc>
+      </w:tr>
+      <w:tr>
+        <w:tc>
+          <w:tcPr>
+            <w:tcW w:w="697" w:type="pct"/>
+          </w:tcPr>
+          <w:p>
+            <w:pPr>
+              <w:pStyle w:val="Prrafodelista"/>
+              <w:spacing w:line="360" w:lineRule="auto"/>
+              <w:ind w:left="0"/>
+              <w:jc w:val="center"/>
+              <w:rPr>
+                <w:rFonts w:ascii="Times New Roman" w:hAnsi="Times New Roman" w:cs="Times New Roman"/>
+              </w:rPr>
+            </w:pPr>
+            <w:r>
+              <w:rPr>
+                <w:rFonts w:ascii="Times New Roman" w:hAnsi="Times New Roman" w:cs="Times New Roman"/>
+              </w:rPr>
+              <w:t>P1897</w:t>
+            </w:r>
+          </w:p>
+        </w:tc>
+        <w:tc>
+          <w:tcPr>
+            <w:tcW w:w="1222" w:type="pct"/>
+          </w:tcPr>
+          <w:p>
+            <w:pPr>
+              <w:pStyle w:val="Prrafodelista"/>
+              <w:spacing w:line="360" w:lineRule="auto"/>
+              <w:ind w:left="0"/>
+              <w:jc w:val="center"/>
+              <w:rPr>
+                <w:rFonts w:ascii="Times New Roman" w:hAnsi="Times New Roman" w:cs="Times New Roman"/>
+              </w:rPr>
+            </w:pPr>
+            <w:r>
+              <w:rPr>
+                <w:rFonts w:ascii="Times New Roman" w:hAnsi="Times New Roman" w:cs="Times New Roman"/>
+              </w:rPr>
+              <w:t>172</w:t>
+            </w:r>
+            <w:r>
+              <w:rPr>
+                <w:rFonts w:ascii="Times New Roman" w:hAnsi="Times New Roman" w:cs="Times New Roman"/>
+              </w:rPr>
+              <w:t>.</w:t>
+            </w:r>
+            <w:r>
+              <w:rPr>
+                <w:rFonts w:ascii="Times New Roman" w:hAnsi="Times New Roman" w:cs="Times New Roman"/>
+              </w:rPr>
+              <w:t>025</w:t>
+            </w:r>
+          </w:p>
+        </w:tc>
+        <w:tc>
+          <w:tcPr>
+            <w:tcW w:w="1744" w:type="pct"/>
+          </w:tcPr>
+          <w:p>
+            <w:pPr>
+              <w:pStyle w:val="Prrafodelista"/>
+              <w:spacing w:line="360" w:lineRule="auto"/>
+              <w:ind w:left="0"/>
+              <w:jc w:val="center"/>
+              <w:rPr>
+                <w:rFonts w:ascii="Times New Roman" w:hAnsi="Times New Roman" w:cs="Times New Roman"/>
+              </w:rPr>
+            </w:pPr>
+            <w:r>
+              <w:rPr>
+                <w:rFonts w:ascii="Times New Roman" w:hAnsi="Times New Roman" w:cs="Times New Roman"/>
+              </w:rPr>
+              <w:t>0</w:t>
+            </w:r>
+          </w:p>
+        </w:tc>
+        <w:tc>
+          <w:tcPr>
+            <w:tcW w:w="1336" w:type="pct"/>
+          </w:tcPr>
+          <w:p>
+            <w:pPr>
+              <w:pStyle w:val="Prrafodelista"/>
+              <w:spacing w:line="360" w:lineRule="auto"/>
+              <w:ind w:left="0"/>
+              <w:jc w:val="center"/>
+              <w:rPr>
+                <w:rFonts w:ascii="Times New Roman" w:hAnsi="Times New Roman" w:cs="Times New Roman"/>
+              </w:rPr>
+            </w:pPr>
+            <w:r>
+              <w:rPr>
+                <w:rFonts w:ascii="Times New Roman" w:hAnsi="Times New Roman" w:cs="Times New Roman"/>
+              </w:rPr>
+              <w:t>0</w:t>
+            </w:r>
+          </w:p>
+        </w:tc>
+      </w:tr>
+    </w:tbl>
+    <w:p>
+      <w:pPr>
+        <w:spacing w:line="360" w:lineRule="auto"/>
+        <w:rPr>
+          <w:rFonts w:ascii="Times New Roman" w:hAnsi="Times New Roman" w:cs="Times New Roman"/>
+        </w:rPr>
+      </w:pPr>
+      <w:r>
+        <w:rPr>
+          <w:rFonts w:ascii="Times New Roman" w:hAnsi="Times New Roman" w:cs="Times New Roman"/>
+        </w:rPr>
+        <w:tab/>
+      </w:r>
+    </w:p>
+    <w:tbl>
+      <w:tblPr>
+        <w:tblStyle w:val="Tablaconcuadrcula"/>
+        <w:tblW w:w="0" w:type="auto"/>
+        <w:tblInd w:w="704" w:type="dxa"/>
+        <w:tblLook w:val="04A0" w:firstRow="1" w:lastRow="0" w:firstColumn="1" w:lastColumn="0" w:noHBand="0" w:noVBand="1"/>
+      </w:tblPr>
+      <w:tblGrid>
+        <w:gridCol w:w="2238"/>
+        <w:gridCol w:w="2943"/>
+        <w:gridCol w:w="2943"/>
+      </w:tblGrid>
+      <w:tr>
+        <w:tc>
+          <w:tcPr>
+            <w:tcW w:w="2238" w:type="dxa"/>
+          </w:tcPr>
+          <w:p>
+            <w:pPr>
+              <w:spacing w:line="360" w:lineRule="auto"/>
+              <w:jc w:val="center"/>
+              <w:rPr>
+                <w:rFonts w:ascii="Times New Roman" w:hAnsi="Times New Roman" w:cs="Times New Roman"/>
+                <w:b/>
+                <w:bCs/>
+              </w:rPr>
+            </w:pPr>
+            <w:r>
+              <w:rPr>
+                <w:rFonts w:ascii="Times New Roman" w:hAnsi="Times New Roman" w:cs="Times New Roman"/>
+                <w:b/>
+                <w:bCs/>
+              </w:rPr>
+              <w:t>Variable</w:t>
+            </w:r>
+          </w:p>
+        </w:tc>
+        <w:tc>
+          <w:tcPr>
+            <w:tcW w:w="2943" w:type="dxa"/>
+          </w:tcPr>
+          <w:p>
+            <w:pPr>
+              <w:spacing w:line="360" w:lineRule="auto"/>
+              <w:jc w:val="center"/>
+              <w:rPr>
+                <w:rFonts w:ascii="Times New Roman" w:hAnsi="Times New Roman" w:cs="Times New Roman"/>
+                <w:b/>
+                <w:bCs/>
+              </w:rPr>
+            </w:pPr>
+            <w:r>
+              <w:rPr>
+                <w:rFonts w:ascii="Times New Roman" w:hAnsi="Times New Roman" w:cs="Times New Roman"/>
+                <w:b/>
+                <w:bCs/>
+              </w:rPr>
+              <w:t>Min</w:t>
+            </w:r>
+          </w:p>
+        </w:tc>
+        <w:tc>
+          <w:tcPr>
+            <w:tcW w:w="2943" w:type="dxa"/>
+          </w:tcPr>
+          <w:p>
+            <w:pPr>
+              <w:spacing w:line="360" w:lineRule="auto"/>
+              <w:jc w:val="center"/>
+              <w:rPr>
+                <w:rFonts w:ascii="Times New Roman" w:hAnsi="Times New Roman" w:cs="Times New Roman"/>
+                <w:b/>
+                <w:bCs/>
+              </w:rPr>
+            </w:pPr>
+            <w:r>
+              <w:rPr>
+                <w:rFonts w:ascii="Times New Roman" w:hAnsi="Times New Roman" w:cs="Times New Roman"/>
+                <w:b/>
+                <w:bCs/>
+              </w:rPr>
+              <w:t>Max</w:t>
+            </w:r>
+          </w:p>
+        </w:tc>
+      </w:tr>
+      <w:tr>
+        <w:tc>
+          <w:tcPr>
+            <w:tcW w:w="2238" w:type="dxa"/>
+          </w:tcPr>
+          <w:p>
+            <w:pPr>
+              <w:spacing w:line="360" w:lineRule="auto"/>
+              <w:jc w:val="center"/>
+              <w:rPr>
+                <w:rFonts w:ascii="Times New Roman" w:hAnsi="Times New Roman" w:cs="Times New Roman"/>
+              </w:rPr>
+            </w:pPr>
+            <w:r>
+              <w:rPr>
+                <w:rFonts w:ascii="Times New Roman" w:hAnsi="Times New Roman" w:cs="Times New Roman"/>
+              </w:rPr>
+              <w:t>P6040</w:t>
+            </w:r>
+          </w:p>
+        </w:tc>
+        <w:tc>
+          <w:tcPr>
+            <w:tcW w:w="2943" w:type="dxa"/>
+          </w:tcPr>
+          <w:p>
+            <w:pPr>
+              <w:spacing w:line="360" w:lineRule="auto"/>
+              <w:jc w:val="center"/>
+              <w:rPr>
+                <w:rFonts w:ascii="Times New Roman" w:hAnsi="Times New Roman" w:cs="Times New Roman"/>
+              </w:rPr>
+            </w:pPr>
+            <w:r>
+              <w:rPr>
+                <w:rFonts w:ascii="Times New Roman" w:hAnsi="Times New Roman" w:cs="Times New Roman"/>
+              </w:rPr>
+              <w:t>18</w:t>
+            </w:r>
+          </w:p>
+        </w:tc>
+        <w:tc>
+          <w:tcPr>
+            <w:tcW w:w="2943" w:type="dxa"/>
+          </w:tcPr>
+          <w:p>
+            <w:pPr>
+              <w:spacing w:line="360" w:lineRule="auto"/>
+              <w:jc w:val="center"/>
+              <w:rPr>
+                <w:rFonts w:ascii="Times New Roman" w:hAnsi="Times New Roman" w:cs="Times New Roman"/>
+              </w:rPr>
+            </w:pPr>
+            <w:r>
+              <w:rPr>
+                <w:rFonts w:ascii="Times New Roman" w:hAnsi="Times New Roman" w:cs="Times New Roman"/>
+              </w:rPr>
+              <w:t>108</w:t>
+            </w:r>
+          </w:p>
+        </w:tc>
+      </w:tr>
+      <w:tr>
+        <w:tc>
+          <w:tcPr>
+            <w:tcW w:w="2238" w:type="dxa"/>
+          </w:tcPr>
+          <w:p>
+            <w:pPr>
+              <w:spacing w:line="360" w:lineRule="auto"/>
+              <w:jc w:val="center"/>
+              <w:rPr>
+                <w:rFonts w:ascii="Times New Roman" w:hAnsi="Times New Roman" w:cs="Times New Roman"/>
+              </w:rPr>
+            </w:pPr>
+            <w:r>
+              <w:rPr>
+                <w:rFonts w:ascii="Times New Roman" w:hAnsi="Times New Roman" w:cs="Times New Roman"/>
+              </w:rPr>
+              <w:t>P1897</w:t>
+            </w:r>
+          </w:p>
+        </w:tc>
+        <w:tc>
+          <w:tcPr>
+            <w:tcW w:w="2943" w:type="dxa"/>
+          </w:tcPr>
+          <w:p>
+            <w:pPr>
+              <w:spacing w:line="360" w:lineRule="auto"/>
+              <w:jc w:val="center"/>
+              <w:rPr>
+                <w:rFonts w:ascii="Times New Roman" w:hAnsi="Times New Roman" w:cs="Times New Roman"/>
+              </w:rPr>
+            </w:pPr>
+            <w:r>
+              <w:rPr>
+                <w:rFonts w:ascii="Times New Roman" w:hAnsi="Times New Roman" w:cs="Times New Roman"/>
+              </w:rPr>
+              <w:t>0</w:t>
+            </w:r>
+          </w:p>
+        </w:tc>
+        <w:tc>
+          <w:tcPr>
+            <w:tcW w:w="2943" w:type="dxa"/>
+          </w:tcPr>
+          <w:p>
+            <w:pPr>
+              <w:spacing w:line="360" w:lineRule="auto"/>
+              <w:jc w:val="center"/>
+              <w:rPr>
+                <w:rFonts w:ascii="Times New Roman" w:hAnsi="Times New Roman" w:cs="Times New Roman"/>
+              </w:rPr>
+            </w:pPr>
+            <w:r>
+              <w:rPr>
+                <w:rFonts w:ascii="Times New Roman" w:hAnsi="Times New Roman" w:cs="Times New Roman"/>
+              </w:rPr>
+              <w:t>10</w:t>
+            </w:r>
+          </w:p>
+        </w:tc>
+      </w:tr>
+    </w:tbl>
+    <w:p>
+      <w:pPr>
+        <w:spacing w:line="360" w:lineRule="auto"/>
+        <w:rPr>
+          <w:rFonts w:ascii="Times New Roman" w:hAnsi="Times New Roman" w:cs="Times New Roman"/>
+        </w:rPr>
+      </w:pPr>
+    </w:p>
+    <w:p>
+      <w:pPr>
+        <w:spacing w:line="360" w:lineRule="auto"/>
+        <w:ind w:left="708"/>
+        <w:rPr>
+          <w:rFonts w:ascii="Times New Roman" w:hAnsi="Times New Roman" w:cs="Times New Roman"/>
+        </w:rPr>
+      </w:pPr>
+      <w:r>
+        <w:rPr>
+          <w:rFonts w:ascii="Times New Roman" w:hAnsi="Times New Roman" w:cs="Times New Roman"/>
+          <w:b/>
+          <w:bCs/>
+        </w:rPr>
+        <w:t xml:space="preserve">Observación: </w:t>
+      </w:r>
+      <w:r>
+        <w:rPr>
+          <w:rFonts w:ascii="Times New Roman" w:hAnsi="Times New Roman" w:cs="Times New Roman"/>
+        </w:rPr>
+        <w:t>N</w:t>
+      </w:r>
+      <w:r>
+        <w:rPr>
+          <w:rFonts w:ascii="Times New Roman" w:hAnsi="Times New Roman" w:cs="Times New Roman"/>
+        </w:rPr>
+        <w:t xml:space="preserve">inguna de las </w:t>
+      </w:r>
+      <w:r>
+        <w:rPr>
+          <w:rFonts w:ascii="Times New Roman" w:hAnsi="Times New Roman" w:cs="Times New Roman"/>
+        </w:rPr>
+        <w:t xml:space="preserve">variables necesarias para </w:t>
+      </w:r>
+      <w:r>
+        <w:rPr>
+          <w:rFonts w:ascii="Times New Roman" w:hAnsi="Times New Roman" w:cs="Times New Roman"/>
+          <w:u w:val="single"/>
+        </w:rPr>
+        <w:t>este</w:t>
+      </w:r>
+      <w:r>
+        <w:rPr>
+          <w:rFonts w:ascii="Times New Roman" w:hAnsi="Times New Roman" w:cs="Times New Roman"/>
+        </w:rPr>
+        <w:t xml:space="preserve"> estudio tiene datos faltantes o que requ</w:t>
+      </w:r>
+      <w:r>
+        <w:rPr>
+          <w:rFonts w:ascii="Times New Roman" w:hAnsi="Times New Roman" w:cs="Times New Roman"/>
+        </w:rPr>
+        <w:t>ieran un tratamiento especial</w:t>
+      </w:r>
+      <w:r>
+        <w:rPr>
+          <w:rFonts w:ascii="Times New Roman" w:hAnsi="Times New Roman" w:cs="Times New Roman"/>
+        </w:rPr>
+        <w:t>, pues todas las respuestas están dentro del rango esperado</w:t>
+      </w:r>
+      <w:r>
+        <w:rPr>
+          <w:rFonts w:ascii="Times New Roman" w:hAnsi="Times New Roman" w:cs="Times New Roman"/>
+        </w:rPr>
+        <w:t>.</w:t>
+      </w:r>
     </w:p>
     <w:sectPr>
       <w:pgSz w:w="12240" w:h="15840"/>
@@ -728,6 +1967,131 @@
     </w:lvl>
   </w:abstractNum>
   <w:abstractNum w:abstractNumId="2" w15:restartNumberingAfterBreak="0">
+    <w:nsid w:val="3B212391"/>
+    <w:multiLevelType w:val="multilevel"/>
+    <w:tmpl w:val="D870F1E0"/>
+    <w:lvl w:ilvl="0">
+      <w:start w:val="1"/>
+      <w:numFmt w:val="decimal"/>
+      <w:lvlText w:val="%1."/>
+      <w:lvlJc w:val="left"/>
+      <w:pPr>
+        <w:ind w:left="360" w:hanging="360"/>
+      </w:pPr>
+      <w:rPr>
+        <w:rFonts w:hint="default"/>
+        <w:b/>
+        <w:bCs/>
+      </w:rPr>
+    </w:lvl>
+    <w:lvl w:ilvl="1">
+      <w:start w:val="1"/>
+      <w:numFmt w:val="decimal"/>
+      <w:isLgl/>
+      <w:lvlText w:val="%1.%2."/>
+      <w:lvlJc w:val="left"/>
+      <w:pPr>
+        <w:ind w:left="643" w:hanging="360"/>
+      </w:pPr>
+      <w:rPr>
+        <w:rFonts w:hint="default"/>
+        <w:b/>
+        <w:bCs/>
+      </w:rPr>
+    </w:lvl>
+    <w:lvl w:ilvl="2">
+      <w:start w:val="1"/>
+      <w:numFmt w:val="decimal"/>
+      <w:isLgl/>
+      <w:lvlText w:val="%1.%2.%3."/>
+      <w:lvlJc w:val="left"/>
+      <w:pPr>
+        <w:ind w:left="1429" w:hanging="720"/>
+      </w:pPr>
+      <w:rPr>
+        <w:rFonts w:hint="default"/>
+      </w:rPr>
+    </w:lvl>
+    <w:lvl w:ilvl="3">
+      <w:start w:val="1"/>
+      <w:numFmt w:val="decimal"/>
+      <w:isLgl/>
+      <w:lvlText w:val="%1.%2.%3.%4."/>
+      <w:lvlJc w:val="left"/>
+      <w:pPr>
+        <w:ind w:left="720" w:hanging="720"/>
+      </w:pPr>
+      <w:rPr>
+        <w:rFonts w:hint="default"/>
+      </w:rPr>
+    </w:lvl>
+    <w:lvl w:ilvl="4">
+      <w:start w:val="1"/>
+      <w:numFmt w:val="decimal"/>
+      <w:isLgl/>
+      <w:lvlText w:val="%1.%2.%3.%4.%5."/>
+      <w:lvlJc w:val="left"/>
+      <w:pPr>
+        <w:ind w:left="1080" w:hanging="1080"/>
+      </w:pPr>
+      <w:rPr>
+        <w:rFonts w:hint="default"/>
+      </w:rPr>
+    </w:lvl>
+    <w:lvl w:ilvl="5">
+      <w:start w:val="1"/>
+      <w:numFmt w:val="decimal"/>
+      <w:isLgl/>
+      <w:lvlText w:val="%1.%2.%3.%4.%5.%6."/>
+      <w:lvlJc w:val="left"/>
+      <w:pPr>
+        <w:ind w:left="1080" w:hanging="1080"/>
+      </w:pPr>
+      <w:rPr>
+        <w:rFonts w:hint="default"/>
+      </w:rPr>
+    </w:lvl>
+    <w:lvl w:ilvl="6">
+      <w:start w:val="1"/>
+      <w:numFmt w:val="decimal"/>
+      <w:isLgl/>
+      <w:lvlText w:val="%1.%2.%3.%4.%5.%6.%7."/>
+      <w:lvlJc w:val="left"/>
+      <w:pPr>
+        <w:ind w:left="1440" w:hanging="1440"/>
+      </w:pPr>
+      <w:rPr>
+        <w:rFonts w:hint="default"/>
+      </w:rPr>
+    </w:lvl>
+    <w:lvl w:ilvl="7">
+      <w:start w:val="1"/>
+      <w:numFmt w:val="decimal"/>
+      <w:isLgl/>
+      <w:lvlText w:val="%1.%2.%3.%4.%5.%6.%7.%8."/>
+      <w:lvlJc w:val="left"/>
+      <w:pPr>
+        <w:ind w:left="1440" w:hanging="1440"/>
+      </w:pPr>
+      <w:rPr>
+        <w:rFonts w:hint="default"/>
+      </w:rPr>
+    </w:lvl>
+    <w:lvl w:ilvl="8">
+      <w:start w:val="1"/>
+      <w:numFmt w:val="decimal"/>
+      <w:isLgl/>
+      <w:lvlText w:val="%1.%2.%3.%4.%5.%6.%7.%8.%9."/>
+      <w:lvlJc w:val="left"/>
+      <w:pPr>
+        <w:ind w:left="1800" w:hanging="1800"/>
+      </w:pPr>
+      <w:rPr>
+        <w:rFonts w:hint="default"/>
+      </w:rPr>
+    </w:lvl>
+  </w:abstractNum>
+  <w:abstractNum w:abstractNumId="3" w15:restartNumberingAfterBreak="0">
     <w:nsid w:val="45075AE2"/>
     <w:multiLevelType w:val="hybridMultilevel"/>
     <w:tmpl w:val="9D1E0190"/>
@@ -737,7 +2101,7 @@
       <w:lvlText w:val=""/>
       <w:lvlJc w:val="left"/>
       <w:pPr>
-        <w:ind w:left="1080" w:hanging="360"/>
+        <w:ind w:left="927" w:hanging="360"/>
       </w:pPr>
       <w:rPr>
         <w:rFonts w:ascii="Symbol" w:eastAsiaTheme="minorHAnsi" w:hAnsi="Symbol" w:cs="Times New Roman" w:hint="default"/>
@@ -749,7 +2113,7 @@
       <w:lvlText w:val="o"/>
       <w:lvlJc w:val="left"/>
       <w:pPr>
-        <w:ind w:left="1800" w:hanging="360"/>
+        <w:ind w:left="1647" w:hanging="360"/>
       </w:pPr>
       <w:rPr>
         <w:rFonts w:ascii="Courier New" w:hAnsi="Courier New" w:cs="Courier New" w:hint="default"/>
@@ -761,7 +2125,7 @@
       <w:lvlText w:val=""/>
       <w:lvlJc w:val="left"/>
       <w:pPr>
-        <w:ind w:left="2520" w:hanging="360"/>
+        <w:ind w:left="2367" w:hanging="360"/>
       </w:pPr>
       <w:rPr>
         <w:rFonts w:ascii="Wingdings" w:hAnsi="Wingdings" w:hint="default"/>
@@ -773,7 +2137,7 @@
       <w:lvlText w:val=""/>
       <w:lvlJc w:val="left"/>
       <w:pPr>
-        <w:ind w:left="3240" w:hanging="360"/>
+        <w:ind w:left="3087" w:hanging="360"/>
       </w:pPr>
       <w:rPr>
         <w:rFonts w:ascii="Symbol" w:hAnsi="Symbol" w:hint="default"/>
@@ -785,7 +2149,7 @@
       <w:lvlText w:val="o"/>
       <w:lvlJc w:val="left"/>
       <w:pPr>
-        <w:ind w:left="3960" w:hanging="360"/>
+        <w:ind w:left="3807" w:hanging="360"/>
       </w:pPr>
       <w:rPr>
         <w:rFonts w:ascii="Courier New" w:hAnsi="Courier New" w:cs="Courier New" w:hint="default"/>
@@ -797,7 +2161,7 @@
       <w:lvlText w:val=""/>
       <w:lvlJc w:val="left"/>
       <w:pPr>
-        <w:ind w:left="4680" w:hanging="360"/>
+        <w:ind w:left="4527" w:hanging="360"/>
       </w:pPr>
       <w:rPr>
         <w:rFonts w:ascii="Wingdings" w:hAnsi="Wingdings" w:hint="default"/>
@@ -809,7 +2173,7 @@
       <w:lvlText w:val=""/>
       <w:lvlJc w:val="left"/>
       <w:pPr>
-        <w:ind w:left="5400" w:hanging="360"/>
+        <w:ind w:left="5247" w:hanging="360"/>
       </w:pPr>
       <w:rPr>
         <w:rFonts w:ascii="Symbol" w:hAnsi="Symbol" w:hint="default"/>
@@ -821,7 +2185,7 @@
       <w:lvlText w:val="o"/>
       <w:lvlJc w:val="left"/>
       <w:pPr>
-        <w:ind w:left="6120" w:hanging="360"/>
+        <w:ind w:left="5967" w:hanging="360"/>
       </w:pPr>
       <w:rPr>
         <w:rFonts w:ascii="Courier New" w:hAnsi="Courier New" w:cs="Courier New" w:hint="default"/>
@@ -833,14 +2197,14 @@
       <w:lvlText w:val=""/>
       <w:lvlJc w:val="left"/>
       <w:pPr>
-        <w:ind w:left="6840" w:hanging="360"/>
+        <w:ind w:left="6687" w:hanging="360"/>
       </w:pPr>
       <w:rPr>
         <w:rFonts w:ascii="Wingdings" w:hAnsi="Wingdings" w:hint="default"/>
       </w:rPr>
     </w:lvl>
   </w:abstractNum>
-  <w:abstractNum w:abstractNumId="3" w15:restartNumberingAfterBreak="0">
+  <w:abstractNum w:abstractNumId="4" w15:restartNumberingAfterBreak="0">
     <w:nsid w:val="6C2E656B"/>
     <w:multiLevelType w:val="hybridMultilevel"/>
     <w:tmpl w:val="DCA2BDB4"/>
@@ -929,17 +2293,114 @@
       </w:pPr>
     </w:lvl>
   </w:abstractNum>
+  <w:abstractNum w:abstractNumId="5" w15:restartNumberingAfterBreak="0">
+    <w:nsid w:val="7E7930EE"/>
+    <w:multiLevelType w:val="hybridMultilevel"/>
+    <w:tmpl w:val="F4B6A214"/>
+    <w:lvl w:ilvl="0" w:tplc="4F38A82A">
+      <w:start w:val="1"/>
+      <w:numFmt w:val="lowerLetter"/>
+      <w:lvlText w:val="%1."/>
+      <w:lvlJc w:val="left"/>
+      <w:pPr>
+        <w:ind w:left="1069" w:hanging="360"/>
+      </w:pPr>
+      <w:rPr>
+        <w:rFonts w:hint="default"/>
+        <w:b/>
+        <w:bCs/>
+      </w:rPr>
+    </w:lvl>
+    <w:lvl w:ilvl="1" w:tplc="240A0019" w:tentative="1">
+      <w:start w:val="1"/>
+      <w:numFmt w:val="lowerLetter"/>
+      <w:lvlText w:val="%2."/>
+      <w:lvlJc w:val="left"/>
+      <w:pPr>
+        <w:ind w:left="1789" w:hanging="360"/>
+      </w:pPr>
+    </w:lvl>
+    <w:lvl w:ilvl="2" w:tplc="240A001B" w:tentative="1">
+      <w:start w:val="1"/>
+      <w:numFmt w:val="lowerRoman"/>
+      <w:lvlText w:val="%3."/>
+      <w:lvlJc w:val="right"/>
+      <w:pPr>
+        <w:ind w:left="2509" w:hanging="180"/>
+      </w:pPr>
+    </w:lvl>
+    <w:lvl w:ilvl="3" w:tplc="240A000F" w:tentative="1">
+      <w:start w:val="1"/>
+      <w:numFmt w:val="decimal"/>
+      <w:lvlText w:val="%4."/>
+      <w:lvlJc w:val="left"/>
+      <w:pPr>
+        <w:ind w:left="3229" w:hanging="360"/>
+      </w:pPr>
+    </w:lvl>
+    <w:lvl w:ilvl="4" w:tplc="240A0019" w:tentative="1">
+      <w:start w:val="1"/>
+      <w:numFmt w:val="lowerLetter"/>
+      <w:lvlText w:val="%5."/>
+      <w:lvlJc w:val="left"/>
+      <w:pPr>
+        <w:ind w:left="3949" w:hanging="360"/>
+      </w:pPr>
+    </w:lvl>
+    <w:lvl w:ilvl="5" w:tplc="240A001B" w:tentative="1">
+      <w:start w:val="1"/>
+      <w:numFmt w:val="lowerRoman"/>
+      <w:lvlText w:val="%6."/>
+      <w:lvlJc w:val="right"/>
+      <w:pPr>
+        <w:ind w:left="4669" w:hanging="180"/>
+      </w:pPr>
+    </w:lvl>
+    <w:lvl w:ilvl="6" w:tplc="240A000F" w:tentative="1">
+      <w:start w:val="1"/>
+      <w:numFmt w:val="decimal"/>
+      <w:lvlText w:val="%7."/>
+      <w:lvlJc w:val="left"/>
+      <w:pPr>
+        <w:ind w:left="5389" w:hanging="360"/>
+      </w:pPr>
+    </w:lvl>
+    <w:lvl w:ilvl="7" w:tplc="240A0019" w:tentative="1">
+      <w:start w:val="1"/>
+      <w:numFmt w:val="lowerLetter"/>
+      <w:lvlText w:val="%8."/>
+      <w:lvlJc w:val="left"/>
+      <w:pPr>
+        <w:ind w:left="6109" w:hanging="360"/>
+      </w:pPr>
+    </w:lvl>
+    <w:lvl w:ilvl="8" w:tplc="240A001B" w:tentative="1">
+      <w:start w:val="1"/>
+      <w:numFmt w:val="lowerRoman"/>
+      <w:lvlText w:val="%9."/>
+      <w:lvlJc w:val="right"/>
+      <w:pPr>
+        <w:ind w:left="6829" w:hanging="180"/>
+      </w:pPr>
+    </w:lvl>
+  </w:abstractNum>
   <w:num w:numId="1" w16cid:durableId="1547446940">
-    <w:abstractNumId w:val="3"/>
+    <w:abstractNumId w:val="4"/>
   </w:num>
   <w:num w:numId="2" w16cid:durableId="865168497">
-    <w:abstractNumId w:val="2"/>
+    <w:abstractNumId w:val="3"/>
   </w:num>
   <w:num w:numId="3" w16cid:durableId="23484770">
     <w:abstractNumId w:val="1"/>
   </w:num>
   <w:num w:numId="4" w16cid:durableId="2117289113">
     <w:abstractNumId w:val="0"/>
+  </w:num>
+  <w:num w:numId="5" w16cid:durableId="932395882">
+    <w:abstractNumId w:val="2"/>
+  </w:num>
+  <w:num w:numId="6" w16cid:durableId="1204832236">
+    <w:abstractNumId w:val="5"/>
   </w:num>
 </w:numbering>
 </file>
@@ -1344,6 +2805,7 @@
   <w:style w:type="paragraph" w:default="1" w:styleId="Normal">
     <w:name w:val="Normal"/>
     <w:qFormat/>
+    <w:rsid w:val="004279AC"/>
   </w:style>
   <w:style w:type="paragraph" w:styleId="Ttulo1">
     <w:name w:val="heading 1"/>
@@ -1547,7 +3009,6 @@
   <w:style w:type="character" w:default="1" w:styleId="Fuentedeprrafopredeter">
     <w:name w:val="Default Paragraph Font"/>
     <w:uiPriority w:val="1"/>
-    <w:semiHidden/>
     <w:unhideWhenUsed/>
   </w:style>
   <w:style w:type="table" w:default="1" w:styleId="Tablanormal">
@@ -1861,6 +3322,25 @@
       <w:spacing w:val="5"/>
     </w:rPr>
   </w:style>
+  <w:style w:type="table" w:styleId="Tablaconcuadrcula">
+    <w:name w:val="Table Grid"/>
+    <w:basedOn w:val="Tablanormal"/>
+    <w:uiPriority w:val="39"/>
+    <w:rsid w:val="005F2AC8"/>
+    <w:pPr>
+      <w:spacing w:after="0" w:line="240" w:lineRule="auto"/>
+    </w:pPr>
+    <w:tblPr>
+      <w:tblBorders>
+        <w:top w:val="single" w:sz="4" w:space="0" w:color="auto"/>
+        <w:left w:val="single" w:sz="4" w:space="0" w:color="auto"/>
+        <w:bottom w:val="single" w:sz="4" w:space="0" w:color="auto"/>
+        <w:right w:val="single" w:sz="4" w:space="0" w:color="auto"/>
+        <w:insideH w:val="single" w:sz="4" w:space="0" w:color="auto"/>
+        <w:insideV w:val="single" w:sz="4" w:space="0" w:color="auto"/>
+      </w:tblBorders>
+    </w:tblPr>
+  </w:style>
 </w:styles>
 </file>
 

</xml_diff>

<commit_message>
informe 4 y 5
</commit_message>
<xml_diff>
--- a/reports/informe.docx
+++ b/reports/informe.docx
@@ -1,6 +1,6 @@
 
 <file path=word/document.xml><?xml version="1.0" encoding="utf-8"?>
-<w:document xmlns:wpc="http://schemas.microsoft.com/office/word/2010/wordprocessingCanvas" xmlns:cx="http://schemas.microsoft.com/office/drawing/2014/chartex" xmlns:cx1="http://schemas.microsoft.com/office/drawing/2015/9/8/chartex" xmlns:cx2="http://schemas.microsoft.com/office/drawing/2015/10/21/chartex" xmlns:cx3="http://schemas.microsoft.com/office/drawing/2016/5/9/chartex" xmlns:cx4="http://schemas.microsoft.com/office/drawing/2016/5/10/chartex" xmlns:cx5="http://schemas.microsoft.com/office/drawing/2016/5/11/chartex" xmlns:cx6="http://schemas.microsoft.com/office/drawing/2016/5/12/chartex" xmlns:cx7="http://schemas.microsoft.com/office/drawing/2016/5/13/chartex" xmlns:cx8="http://schemas.microsoft.com/office/drawing/2016/5/14/chartex" xmlns:mc="http://schemas.openxmlformats.org/markup-compatibility/2006" xmlns:m="http://schemas.openxmlformats.org/officeDocument/2006/math" xmlns:aink="http://schemas.microsoft.com/office/drawing/2016/ink" xmlns:am3d="http://schemas.microsoft.com/office/drawing/2017/model3d" xmlns:oel="http://schemas.microsoft.com/office/2019/extlst" xmlns:r="http://schemas.openxmlformats.org/officeDocument/2006/relationships" xmlns:wp14="http://schemas.microsoft.com/office/word/2010/wordprocessingDrawing" xmlns:wp="http://schemas.openxmlformats.org/drawingml/2006/wordprocessingDrawing" xmlns:wpg="http://schemas.microsoft.com/office/word/2010/wordprocessingGroup" xmlns:wpi="http://schemas.microsoft.com/office/word/2010/wordprocessingInk" xmlns:wps="http://schemas.microsoft.com/office/word/2010/wordprocessingShape" xmlns:o="urn:schemas-microsoft-com:office:office" xmlns:v="urn:schemas-microsoft-com:vml" xmlns:w10="urn:schemas-microsoft-com:office:word" xmlns:w="http://schemas.openxmlformats.org/wordprocessingml/2006/main" xmlns:w14="http://schemas.microsoft.com/office/word/2010/wordml" xmlns:w15="http://schemas.microsoft.com/office/word/2012/wordml" xmlns:w16cex="http://schemas.microsoft.com/office/word/2018/wordml/cex" xmlns:w16cid="http://schemas.microsoft.com/office/word/2016/wordml/cid" xmlns:w16="http://schemas.microsoft.com/office/word/2018/wordml" xmlns:w16sdtdh="http://schemas.microsoft.com/office/word/2020/wordml/sdtdatahash" xmlns:w16sdtfl="http://schemas.microsoft.com/office/word/2024/wordml/sdtformatlock" xmlns:w16se="http://schemas.microsoft.com/office/word/2015/wordml/symex" xmlns:w16du="http://schemas.microsoft.com/office/word/2023/wordml/word16du" xmlns:wne="http://schemas.microsoft.com/office/word/2006/wordml" mc:Ignorable="w14 w15 w16se w16cid w16 w16cex w16sdtdh w16sdtfl w16du wp14">
+<w:document xmlns:wpc="http://schemas.microsoft.com/office/word/2010/wordprocessingCanvas" xmlns:cx="http://schemas.microsoft.com/office/drawing/2014/chartex" xmlns:cx1="http://schemas.microsoft.com/office/drawing/2015/9/8/chartex" xmlns:cx2="http://schemas.microsoft.com/office/drawing/2015/10/21/chartex" xmlns:cx3="http://schemas.microsoft.com/office/drawing/2016/5/9/chartex" xmlns:cx4="http://schemas.microsoft.com/office/drawing/2016/5/10/chartex" xmlns:cx5="http://schemas.microsoft.com/office/drawing/2016/5/11/chartex" xmlns:cx6="http://schemas.microsoft.com/office/drawing/2016/5/12/chartex" xmlns:cx7="http://schemas.microsoft.com/office/drawing/2016/5/13/chartex" xmlns:cx8="http://schemas.microsoft.com/office/drawing/2016/5/14/chartex" xmlns:mc="http://schemas.openxmlformats.org/markup-compatibility/2006" xmlns:aink="http://schemas.microsoft.com/office/drawing/2016/ink" xmlns:am3d="http://schemas.microsoft.com/office/drawing/2017/model3d" xmlns:o="urn:schemas-microsoft-com:office:office" xmlns:oel="http://schemas.microsoft.com/office/2019/extlst" xmlns:r="http://schemas.openxmlformats.org/officeDocument/2006/relationships" xmlns:m="http://schemas.openxmlformats.org/officeDocument/2006/math" xmlns:v="urn:schemas-microsoft-com:vml" xmlns:wp14="http://schemas.microsoft.com/office/word/2010/wordprocessingDrawing" xmlns:wp="http://schemas.openxmlformats.org/drawingml/2006/wordprocessingDrawing" xmlns:w10="urn:schemas-microsoft-com:office:word" xmlns:w="http://schemas.openxmlformats.org/wordprocessingml/2006/main" xmlns:w14="http://schemas.microsoft.com/office/word/2010/wordml" xmlns:w15="http://schemas.microsoft.com/office/word/2012/wordml" xmlns:w16cex="http://schemas.microsoft.com/office/word/2018/wordml/cex" xmlns:w16cid="http://schemas.microsoft.com/office/word/2016/wordml/cid" xmlns:w16="http://schemas.microsoft.com/office/word/2018/wordml" xmlns:w16du="http://schemas.microsoft.com/office/word/2023/wordml/word16du" xmlns:w16sdtdh="http://schemas.microsoft.com/office/word/2020/wordml/sdtdatahash" xmlns:w16sdtfl="http://schemas.microsoft.com/office/word/2024/wordml/sdtformatlock" xmlns:w16se="http://schemas.microsoft.com/office/word/2015/wordml/symex" xmlns:wpg="http://schemas.microsoft.com/office/word/2010/wordprocessingGroup" xmlns:wpi="http://schemas.microsoft.com/office/word/2010/wordprocessingInk" xmlns:wne="http://schemas.microsoft.com/office/word/2006/wordml" xmlns:wps="http://schemas.microsoft.com/office/word/2010/wordprocessingShape" mc:Ignorable="w14 w15 w16se w16cid w16 w16cex w16sdtdh w16sdtfl w16du wp14">
   <w:body>
     <w:p>
       <w:pPr>
@@ -186,19 +186,11 @@
           <w:rFonts w:ascii="Times New Roman" w:hAnsi="Times New Roman" w:cs="Times New Roman"/>
         </w:rPr>
       </w:pPr>
-      <w:proofErr w:type="spellStart"/>
-      <w:r>
-        <w:rPr>
-          <w:rFonts w:ascii="Times New Roman" w:hAnsi="Times New Roman" w:cs="Times New Roman"/>
-        </w:rPr>
-        <w:t>What</w:t>
-      </w:r>
-      <w:proofErr w:type="spellEnd"/>
-      <w:r>
-        <w:rPr>
-          <w:rFonts w:ascii="Times New Roman" w:hAnsi="Times New Roman" w:cs="Times New Roman"/>
-        </w:rPr>
-        <w:t>:</w:t>
+      <w:r>
+        <w:rPr>
+          <w:rFonts w:ascii="Times New Roman" w:hAnsi="Times New Roman" w:cs="Times New Roman"/>
+        </w:rPr>
+        <w:t>What:</w:t>
       </w:r>
       <w:r>
         <w:rPr>
@@ -255,19 +247,11 @@
           <w:rFonts w:ascii="Times New Roman" w:hAnsi="Times New Roman" w:cs="Times New Roman"/>
         </w:rPr>
       </w:pPr>
-      <w:proofErr w:type="spellStart"/>
-      <w:r>
-        <w:rPr>
-          <w:rFonts w:ascii="Times New Roman" w:hAnsi="Times New Roman" w:cs="Times New Roman"/>
-        </w:rPr>
-        <w:t>Where</w:t>
-      </w:r>
-      <w:proofErr w:type="spellEnd"/>
-      <w:r>
-        <w:rPr>
-          <w:rFonts w:ascii="Times New Roman" w:hAnsi="Times New Roman" w:cs="Times New Roman"/>
-        </w:rPr>
-        <w:t xml:space="preserve">: </w:t>
+      <w:r>
+        <w:rPr>
+          <w:rFonts w:ascii="Times New Roman" w:hAnsi="Times New Roman" w:cs="Times New Roman"/>
+        </w:rPr>
+        <w:t xml:space="preserve">Where: </w:t>
       </w:r>
       <w:r>
         <w:rPr>
@@ -294,19 +278,11 @@
           <w:rFonts w:ascii="Times New Roman" w:hAnsi="Times New Roman" w:cs="Times New Roman"/>
         </w:rPr>
       </w:pPr>
-      <w:proofErr w:type="spellStart"/>
-      <w:r>
-        <w:rPr>
-          <w:rFonts w:ascii="Times New Roman" w:hAnsi="Times New Roman" w:cs="Times New Roman"/>
-        </w:rPr>
-        <w:t>When</w:t>
-      </w:r>
-      <w:proofErr w:type="spellEnd"/>
-      <w:r>
-        <w:rPr>
-          <w:rFonts w:ascii="Times New Roman" w:hAnsi="Times New Roman" w:cs="Times New Roman"/>
-        </w:rPr>
-        <w:t xml:space="preserve">: </w:t>
+      <w:r>
+        <w:rPr>
+          <w:rFonts w:ascii="Times New Roman" w:hAnsi="Times New Roman" w:cs="Times New Roman"/>
+        </w:rPr>
+        <w:t xml:space="preserve">When: </w:t>
       </w:r>
       <w:r>
         <w:rPr>
@@ -1869,7 +1845,7 @@
         <w:spacing w:line="360" w:lineRule="auto"/>
         <w:rPr>
           <w:rFonts w:ascii="Times New Roman" w:hAnsi="Times New Roman" w:cs="Times New Roman"/>
-          <w:lang w:val="en-CO"/>
+          <w:lang/>
         </w:rPr>
       </w:pPr>
     </w:p>
@@ -2138,46 +2114,6 @@
         <w:spacing w:line="360" w:lineRule="auto"/>
         <w:jc w:val="center"/>
       </w:pPr>
-      <w:r>
-        <w:rPr>
-          <w:noProof/>
-        </w:rPr>
-        <w:drawing>
-          <wp:inline distT="0" distB="0" distL="0" distR="0" wp14:anchorId="0F27F264" wp14:editId="0A8AA652">
-            <wp:extent cx="5029200" cy="3352800"/>
-            <wp:effectExtent l="0" t="0" r="0" b="0"/>
-            <wp:docPr id="10" name="Distribucion_edad"/>
-            <wp:cNvGraphicFramePr>
-              <a:graphicFrameLocks xmlns:a="http://schemas.openxmlformats.org/drawingml/2006/main" noChangeAspect="1"/>
-            </wp:cNvGraphicFramePr>
-            <a:graphic xmlns:a="http://schemas.openxmlformats.org/drawingml/2006/main">
-              <a:graphicData uri="http://schemas.openxmlformats.org/drawingml/2006/picture">
-                <pic:pic xmlns:pic="http://schemas.openxmlformats.org/drawingml/2006/picture">
-                  <pic:nvPicPr>
-                    <pic:cNvPr id="10" name="Distribucion_edad"/>
-                    <pic:cNvPicPr/>
-                  </pic:nvPicPr>
-                  <pic:blipFill>
-                    <a:blip r:embed="rId5"/>
-                    <a:stretch>
-                      <a:fillRect/>
-                    </a:stretch>
-                  </pic:blipFill>
-                  <pic:spPr>
-                    <a:xfrm>
-                      <a:off x="0" y="0"/>
-                      <a:ext cx="5029200" cy="3352800"/>
-                    </a:xfrm>
-                    <a:prstGeom prst="rect">
-                      <a:avLst/>
-                    </a:prstGeom>
-                  </pic:spPr>
-                </pic:pic>
-              </a:graphicData>
-            </a:graphic>
-          </wp:inline>
-        </w:drawing>
-      </w:r>
     </w:p>
     <w:p>
       <w:pPr>
@@ -2433,7 +2369,6 @@
               <w:rPr>
                 <w:rFonts w:ascii="Times New Roman" w:hAnsi="Times New Roman" w:cs="Times New Roman"/>
               </w:rPr>
-              <w:lastRenderedPageBreak/>
               <w:t>2</w:t>
             </w:r>
           </w:p>
@@ -3000,60 +2935,6 @@
         </w:tc>
       </w:tr>
     </w:tbl>
-    <w:p>
-      <w:pPr>
-        <w:spacing w:line="360" w:lineRule="auto"/>
-        <w:rPr>
-          <w:rFonts w:ascii="Times New Roman" w:hAnsi="Times New Roman" w:cs="Times New Roman"/>
-        </w:rPr>
-      </w:pPr>
-    </w:p>
-    <w:p>
-      <w:pPr>
-        <w:spacing w:line="360" w:lineRule="auto"/>
-        <w:jc w:val="center"/>
-      </w:pPr>
-      <w:r>
-        <w:rPr>
-          <w:noProof/>
-        </w:rPr>
-        <w:drawing>
-          <wp:inline distT="0" distB="0" distL="0" distR="0" wp14:anchorId="041B4FEA" wp14:editId="26D5795C">
-            <wp:extent cx="5029200" cy="3352800"/>
-            <wp:effectExtent l="0" t="0" r="0" b="0"/>
-            <wp:docPr id="11" name="Satisfaccion_salud"/>
-            <wp:cNvGraphicFramePr>
-              <a:graphicFrameLocks xmlns:a="http://schemas.openxmlformats.org/drawingml/2006/main" noChangeAspect="1"/>
-            </wp:cNvGraphicFramePr>
-            <a:graphic xmlns:a="http://schemas.openxmlformats.org/drawingml/2006/main">
-              <a:graphicData uri="http://schemas.openxmlformats.org/drawingml/2006/picture">
-                <pic:pic xmlns:pic="http://schemas.openxmlformats.org/drawingml/2006/picture">
-                  <pic:nvPicPr>
-                    <pic:cNvPr id="11" name="Satisfaccion_salud"/>
-                    <pic:cNvPicPr/>
-                  </pic:nvPicPr>
-                  <pic:blipFill>
-                    <a:blip r:embed="rId6"/>
-                    <a:stretch>
-                      <a:fillRect/>
-                    </a:stretch>
-                  </pic:blipFill>
-                  <pic:spPr>
-                    <a:xfrm>
-                      <a:off x="0" y="0"/>
-                      <a:ext cx="5029200" cy="3352800"/>
-                    </a:xfrm>
-                    <a:prstGeom prst="rect">
-                      <a:avLst/>
-                    </a:prstGeom>
-                  </pic:spPr>
-                </pic:pic>
-              </a:graphicData>
-            </a:graphic>
-          </wp:inline>
-        </w:drawing>
-      </w:r>
-    </w:p>
     <w:p>
       <w:pPr>
         <w:spacing w:line="360" w:lineRule="auto"/>
@@ -3097,7 +2978,6 @@
         <w:rPr>
           <w:rFonts w:ascii="Times New Roman" w:hAnsi="Times New Roman" w:cs="Times New Roman"/>
         </w:rPr>
-        <w:lastRenderedPageBreak/>
         <w:t>Se observó que las personas mayores tienden a reportar niveles más bajos de satisfacción con su salud, mientras que las personas más jóvenes tienden a reportar niveles más altos. Sin embargo, esto no significa que la edad sea la causa de esa diferencia: puede que la verdadera razón sea otra variable no medida, como el estado de salud física o la situación laboral, que también cambian con la edad.</w:t>
       </w:r>
     </w:p>
@@ -3144,17 +3024,555 @@
         <w:rPr>
           <w:rFonts w:ascii="Times New Roman" w:hAnsi="Times New Roman" w:cs="Times New Roman"/>
         </w:rPr>
-        <w:t>La edad más alta que aparece en los datos es 108 años. No parece un error (no es un valor imposible como 300 o un número negativo), simplemente es un caso poco común. Por eso se considera un dato válido: una persona muy mayor, pero real.</w:t>
+        <w:t>La edad más alta que aparece en los datos es 108 años. No parece un error (no es un valor imposible como 300 o un número negativo), simplemente es un caso poco común. Por eso se considera un dato válido</w:t>
+      </w:r>
+      <w:r>
+        <w:rPr>
+          <w:rFonts w:ascii="Times New Roman" w:hAnsi="Times New Roman" w:cs="Times New Roman"/>
+        </w:rPr>
+        <w:t>,</w:t>
+      </w:r>
+      <w:r>
+        <w:rPr>
+          <w:rFonts w:ascii="Times New Roman" w:hAnsi="Times New Roman" w:cs="Times New Roman"/>
+        </w:rPr>
+        <w:t xml:space="preserve"> una persona muy mayor pero real.</w:t>
       </w:r>
     </w:p>
     <w:p>
       <w:pPr>
         <w:spacing w:line="360" w:lineRule="auto"/>
-        <w:ind w:left="708"/>
-        <w:rPr>
-          <w:rFonts w:ascii="Times New Roman" w:hAnsi="Times New Roman" w:cs="Times New Roman"/>
-        </w:rPr>
-      </w:pPr>
+        <w:rPr>
+          <w:rFonts w:ascii="Times New Roman" w:hAnsi="Times New Roman" w:cs="Times New Roman"/>
+          <w:b/>
+          <w:bCs/>
+        </w:rPr>
+      </w:pPr>
+      <w:r>
+        <w:rPr>
+          <w:rFonts w:ascii="Times New Roman" w:hAnsi="Times New Roman" w:cs="Times New Roman"/>
+          <w:b/>
+          <w:bCs/>
+        </w:rPr>
+        <w:t>4. Hallazgos</w:t>
+      </w:r>
+    </w:p>
+    <w:p>
+      <w:pPr>
+        <w:spacing w:line="360" w:lineRule="auto"/>
+        <w:rPr>
+          <w:rFonts w:ascii="Times New Roman" w:hAnsi="Times New Roman" w:cs="Times New Roman"/>
+        </w:rPr>
+      </w:pPr>
+      <w:r>
+        <w:rPr>
+          <w:rFonts w:ascii="Times New Roman" w:hAnsi="Times New Roman" w:cs="Times New Roman"/>
+        </w:rPr>
+        <w:t>Los resultados muestran que la satisfacción con la salud se concentra principalmente en valores altos. El 80 % de las personas adultas analizadas reportó niveles de satisfacción entre 7 y 10, y específicamente el 65,1 % se ubicó entre 8 y 10. El nivel más frecuente fue 8, con el 25,9 % de las respuestas. En contraste, únicamente el 5,3 % reportó valores entre 0 y 4. Esto indica que</w:t>
+      </w:r>
+      <w:r>
+        <w:rPr>
+          <w:rFonts w:ascii="Times New Roman" w:hAnsi="Times New Roman" w:cs="Times New Roman"/>
+        </w:rPr>
+        <w:t xml:space="preserve"> </w:t>
+      </w:r>
+      <w:r>
+        <w:rPr>
+          <w:rFonts w:ascii="Times New Roman" w:hAnsi="Times New Roman" w:cs="Times New Roman"/>
+        </w:rPr>
+        <w:t xml:space="preserve">dentro de la muestra analizada predomina una percepción </w:t>
+      </w:r>
+      <w:r>
+        <w:rPr>
+          <w:rFonts w:ascii="Times New Roman" w:hAnsi="Times New Roman" w:cs="Times New Roman"/>
+        </w:rPr>
+        <w:t xml:space="preserve">más </w:t>
+      </w:r>
+      <w:r>
+        <w:rPr>
+          <w:rFonts w:ascii="Times New Roman" w:hAnsi="Times New Roman" w:cs="Times New Roman"/>
+        </w:rPr>
+        <w:t xml:space="preserve">positiva </w:t>
+      </w:r>
+      <w:r>
+        <w:rPr>
+          <w:rFonts w:ascii="Times New Roman" w:hAnsi="Times New Roman" w:cs="Times New Roman"/>
+        </w:rPr>
+        <w:t>d</w:t>
+      </w:r>
+      <w:r>
+        <w:rPr>
+          <w:rFonts w:ascii="Times New Roman" w:hAnsi="Times New Roman" w:cs="Times New Roman"/>
+        </w:rPr>
+        <w:t>el estado de salud.</w:t>
+      </w:r>
+    </w:p>
+    <w:p>
+      <w:pPr>
+        <w:spacing w:line="360" w:lineRule="auto"/>
+        <w:rPr>
+          <w:rFonts w:ascii="Times New Roman" w:hAnsi="Times New Roman" w:cs="Times New Roman"/>
+        </w:rPr>
+      </w:pPr>
+      <w:r>
+        <w:rPr>
+          <w:rFonts w:ascii="Times New Roman" w:hAnsi="Times New Roman" w:cs="Times New Roman"/>
+        </w:rPr>
+        <w:t xml:space="preserve">Al comparar la edad con el nivel de satisfacción también se observa que las personas de mayor edad </w:t>
+      </w:r>
+      <w:r>
+        <w:rPr>
+          <w:rFonts w:ascii="Times New Roman" w:hAnsi="Times New Roman" w:cs="Times New Roman"/>
+        </w:rPr>
+        <w:t>suelen ya</w:t>
+      </w:r>
+      <w:r>
+        <w:rPr>
+          <w:rFonts w:ascii="Times New Roman" w:hAnsi="Times New Roman" w:cs="Times New Roman"/>
+        </w:rPr>
+        <w:t xml:space="preserve"> concentrarse en niveles de satisfacción más bajos, </w:t>
+      </w:r>
+      <w:r>
+        <w:rPr>
+          <w:rFonts w:ascii="Times New Roman" w:hAnsi="Times New Roman" w:cs="Times New Roman"/>
+        </w:rPr>
+        <w:t>y</w:t>
+      </w:r>
+      <w:r>
+        <w:rPr>
+          <w:rFonts w:ascii="Times New Roman" w:hAnsi="Times New Roman" w:cs="Times New Roman"/>
+        </w:rPr>
+        <w:t xml:space="preserve"> que las personas más jóvenes aparecen con </w:t>
+      </w:r>
+      <w:proofErr w:type="spellStart"/>
+      <w:r>
+        <w:rPr>
+          <w:rFonts w:ascii="Times New Roman" w:hAnsi="Times New Roman" w:cs="Times New Roman"/>
+        </w:rPr>
+        <w:t>ma</w:t>
+      </w:r>
+      <w:r>
+        <w:rPr>
+          <w:rFonts w:ascii="Times New Roman" w:hAnsi="Times New Roman" w:cs="Times New Roman"/>
+        </w:rPr>
+        <w:t>s</w:t>
+      </w:r>
+      <w:proofErr w:type="spellEnd"/>
+      <w:r>
+        <w:rPr>
+          <w:rFonts w:ascii="Times New Roman" w:hAnsi="Times New Roman" w:cs="Times New Roman"/>
+        </w:rPr>
+        <w:t xml:space="preserve"> </w:t>
+      </w:r>
+      <w:r>
+        <w:rPr>
+          <w:rFonts w:ascii="Times New Roman" w:hAnsi="Times New Roman" w:cs="Times New Roman"/>
+        </w:rPr>
+        <w:t>frecuencia en niveles altos. Este resultado permite responder la pregunta analítica planteada p</w:t>
+      </w:r>
+      <w:r>
+        <w:rPr>
+          <w:rFonts w:ascii="Times New Roman" w:hAnsi="Times New Roman" w:cs="Times New Roman"/>
+        </w:rPr>
+        <w:t>orque</w:t>
+      </w:r>
+      <w:r>
+        <w:rPr>
+          <w:rFonts w:ascii="Times New Roman" w:hAnsi="Times New Roman" w:cs="Times New Roman"/>
+        </w:rPr>
+        <w:t xml:space="preserve"> sugiere que existe una relación entre la edad y la satisfacción con la salud.</w:t>
+      </w:r>
+      <w:r>
+        <w:rPr>
+          <w:rFonts w:ascii="Times New Roman" w:hAnsi="Times New Roman" w:cs="Times New Roman"/>
+        </w:rPr>
+        <w:t xml:space="preserve"> </w:t>
+      </w:r>
+      <w:r>
+        <w:rPr>
+          <w:rFonts w:ascii="Times New Roman" w:hAnsi="Times New Roman" w:cs="Times New Roman"/>
+        </w:rPr>
+        <w:t>Sin embargo, esta asociación no permite concluir que una mayor edad sea la causa de una menor satisfacción. Pueden existir otras características relacionadas tanto con la edad como con la percepción de salud por ejemplo el estado de salud física, la situación laboral, los ingresos u otras condiciones de vida.</w:t>
+      </w:r>
+    </w:p>
+    <w:p>
+      <w:pPr>
+        <w:spacing w:line="360" w:lineRule="auto"/>
+        <w:rPr>
+          <w:rFonts w:ascii="Times New Roman" w:hAnsi="Times New Roman" w:cs="Times New Roman"/>
+        </w:rPr>
+      </w:pPr>
+      <w:r>
+        <w:rPr>
+          <w:rFonts w:ascii="Times New Roman" w:hAnsi="Times New Roman" w:cs="Times New Roman"/>
+          <w:b/>
+          <w:bCs/>
+        </w:rPr>
+        <w:t>5. Reflexión</w:t>
+      </w:r>
+    </w:p>
+    <w:p>
+      <w:pPr>
+        <w:spacing w:line="360" w:lineRule="auto"/>
+        <w:rPr>
+          <w:rFonts w:ascii="Times New Roman" w:hAnsi="Times New Roman" w:cs="Times New Roman"/>
+          <w:b/>
+          <w:bCs/>
+        </w:rPr>
+      </w:pPr>
+      <w:r>
+        <w:rPr>
+          <w:rFonts w:ascii="Times New Roman" w:hAnsi="Times New Roman" w:cs="Times New Roman"/>
+          <w:b/>
+          <w:bCs/>
+        </w:rPr>
+        <w:lastRenderedPageBreak/>
+        <w:t>¿Qué fue lo más difícil al momento de transformar una necesidad de información en una pregunta analítica?</w:t>
+      </w:r>
+    </w:p>
+    <w:p>
+      <w:pPr>
+        <w:spacing w:line="360" w:lineRule="auto"/>
+        <w:rPr>
+          <w:rFonts w:ascii="Times New Roman" w:hAnsi="Times New Roman" w:cs="Times New Roman"/>
+        </w:rPr>
+      </w:pPr>
+      <w:r>
+        <w:rPr>
+          <w:rFonts w:ascii="Times New Roman" w:hAnsi="Times New Roman" w:cs="Times New Roman"/>
+        </w:rPr>
+        <w:t xml:space="preserve">La principal dificultad </w:t>
+      </w:r>
+      <w:r>
+        <w:rPr>
+          <w:rFonts w:ascii="Times New Roman" w:hAnsi="Times New Roman" w:cs="Times New Roman"/>
+        </w:rPr>
+        <w:t xml:space="preserve">creo que </w:t>
+      </w:r>
+      <w:r>
+        <w:rPr>
+          <w:rFonts w:ascii="Times New Roman" w:hAnsi="Times New Roman" w:cs="Times New Roman"/>
+        </w:rPr>
+        <w:t>fue pasar de una necesidad amplia</w:t>
+      </w:r>
+      <w:r>
+        <w:rPr>
+          <w:rFonts w:ascii="Times New Roman" w:hAnsi="Times New Roman" w:cs="Times New Roman"/>
+        </w:rPr>
+        <w:t xml:space="preserve"> </w:t>
+      </w:r>
+      <w:r>
+        <w:rPr>
+          <w:rFonts w:ascii="Times New Roman" w:hAnsi="Times New Roman" w:cs="Times New Roman"/>
+        </w:rPr>
+        <w:t>como comprender el bienestar de la población, a una pregunta específica que pudiera responderse con las variables disponibles. Fue necesario decidir qué dimensión del bienestar estudiar y qué característica de la población utilizar para compararla. Finalmente se</w:t>
+      </w:r>
+      <w:r>
+        <w:rPr>
+          <w:rFonts w:ascii="Times New Roman" w:hAnsi="Times New Roman" w:cs="Times New Roman"/>
+        </w:rPr>
+        <w:t xml:space="preserve">leccionamos </w:t>
+      </w:r>
+      <w:r>
+        <w:rPr>
+          <w:rFonts w:ascii="Times New Roman" w:hAnsi="Times New Roman" w:cs="Times New Roman"/>
+        </w:rPr>
+        <w:t>la edad y la satisfacción con la salud porque permiten formular una relación cuantitativa concreta y medible.</w:t>
+      </w:r>
+      <w:r>
+        <w:rPr>
+          <w:rFonts w:ascii="Times New Roman" w:hAnsi="Times New Roman" w:cs="Times New Roman"/>
+        </w:rPr>
+        <w:t xml:space="preserve"> </w:t>
+      </w:r>
+      <w:r>
+        <w:rPr>
+          <w:rFonts w:ascii="Times New Roman" w:hAnsi="Times New Roman" w:cs="Times New Roman"/>
+        </w:rPr>
+        <w:t>También fue importante asegurar</w:t>
+      </w:r>
+      <w:r>
+        <w:rPr>
+          <w:rFonts w:ascii="Times New Roman" w:hAnsi="Times New Roman" w:cs="Times New Roman"/>
+        </w:rPr>
+        <w:t>nos</w:t>
+      </w:r>
+      <w:r>
+        <w:rPr>
+          <w:rFonts w:ascii="Times New Roman" w:hAnsi="Times New Roman" w:cs="Times New Roman"/>
+        </w:rPr>
+        <w:t xml:space="preserve"> de que la pregunta no intentara responder demasiados aspectos al mismo tiempo. </w:t>
+      </w:r>
+      <w:r>
+        <w:rPr>
+          <w:rFonts w:ascii="Times New Roman" w:hAnsi="Times New Roman" w:cs="Times New Roman"/>
+        </w:rPr>
+        <w:t>Eso fue lo que</w:t>
+      </w:r>
+      <w:r>
+        <w:rPr>
+          <w:rFonts w:ascii="Times New Roman" w:hAnsi="Times New Roman" w:cs="Times New Roman"/>
+        </w:rPr>
+        <w:t xml:space="preserve"> permitió pasar de un problema general sobre </w:t>
+      </w:r>
+      <w:r>
+        <w:rPr>
+          <w:rFonts w:ascii="Times New Roman" w:hAnsi="Times New Roman" w:cs="Times New Roman"/>
+        </w:rPr>
+        <w:t xml:space="preserve">el </w:t>
+      </w:r>
+      <w:r>
+        <w:rPr>
+          <w:rFonts w:ascii="Times New Roman" w:hAnsi="Times New Roman" w:cs="Times New Roman"/>
+        </w:rPr>
+        <w:t>bienestar a una pregunta</w:t>
+      </w:r>
+      <w:r>
+        <w:rPr>
+          <w:rFonts w:ascii="Times New Roman" w:hAnsi="Times New Roman" w:cs="Times New Roman"/>
+        </w:rPr>
+        <w:t xml:space="preserve"> bien</w:t>
+      </w:r>
+      <w:r>
+        <w:rPr>
+          <w:rFonts w:ascii="Times New Roman" w:hAnsi="Times New Roman" w:cs="Times New Roman"/>
+        </w:rPr>
+        <w:t xml:space="preserve"> enfocada sobre la relación entre edad y satisfacción con la salud.</w:t>
+      </w:r>
+    </w:p>
+    <w:p>
+      <w:pPr>
+        <w:spacing w:line="360" w:lineRule="auto"/>
+        <w:rPr>
+          <w:rFonts w:ascii="Times New Roman" w:hAnsi="Times New Roman" w:cs="Times New Roman"/>
+          <w:b/>
+          <w:bCs/>
+        </w:rPr>
+      </w:pPr>
+      <w:r>
+        <w:rPr>
+          <w:rFonts w:ascii="Times New Roman" w:hAnsi="Times New Roman" w:cs="Times New Roman"/>
+          <w:b/>
+          <w:bCs/>
+        </w:rPr>
+        <w:t>¿Qué decisiones tuvieron que tomar durante la selección y preparación de los datos y cómo influyeron estas decisiones en el análisis?</w:t>
+      </w:r>
+    </w:p>
+    <w:p>
+      <w:pPr>
+        <w:spacing w:line="360" w:lineRule="auto"/>
+        <w:rPr>
+          <w:rFonts w:ascii="Times New Roman" w:hAnsi="Times New Roman" w:cs="Times New Roman"/>
+        </w:rPr>
+      </w:pPr>
+      <w:r>
+        <w:rPr>
+          <w:rFonts w:ascii="Times New Roman" w:hAnsi="Times New Roman" w:cs="Times New Roman"/>
+        </w:rPr>
+        <w:t>Primero se</w:t>
+      </w:r>
+      <w:r>
+        <w:rPr>
+          <w:rFonts w:ascii="Times New Roman" w:hAnsi="Times New Roman" w:cs="Times New Roman"/>
+        </w:rPr>
+        <w:t xml:space="preserve">leccionamos </w:t>
+      </w:r>
+      <w:r>
+        <w:rPr>
+          <w:rFonts w:ascii="Times New Roman" w:hAnsi="Times New Roman" w:cs="Times New Roman"/>
+        </w:rPr>
+        <w:t xml:space="preserve">P6040, </w:t>
+      </w:r>
+      <w:r>
+        <w:rPr>
+          <w:rFonts w:ascii="Times New Roman" w:hAnsi="Times New Roman" w:cs="Times New Roman"/>
+        </w:rPr>
+        <w:t xml:space="preserve">que </w:t>
+      </w:r>
+      <w:r>
+        <w:rPr>
+          <w:rFonts w:ascii="Times New Roman" w:hAnsi="Times New Roman" w:cs="Times New Roman"/>
+        </w:rPr>
+        <w:t>correspond</w:t>
+      </w:r>
+      <w:r>
+        <w:rPr>
+          <w:rFonts w:ascii="Times New Roman" w:hAnsi="Times New Roman" w:cs="Times New Roman"/>
+        </w:rPr>
+        <w:t>ía</w:t>
+      </w:r>
+      <w:r>
+        <w:rPr>
+          <w:rFonts w:ascii="Times New Roman" w:hAnsi="Times New Roman" w:cs="Times New Roman"/>
+        </w:rPr>
+        <w:t xml:space="preserve"> a la edad, y P1897</w:t>
+      </w:r>
+      <w:r>
+        <w:rPr>
+          <w:rFonts w:ascii="Times New Roman" w:hAnsi="Times New Roman" w:cs="Times New Roman"/>
+        </w:rPr>
+        <w:t xml:space="preserve"> que </w:t>
+      </w:r>
+      <w:r>
+        <w:rPr>
+          <w:rFonts w:ascii="Times New Roman" w:hAnsi="Times New Roman" w:cs="Times New Roman"/>
+        </w:rPr>
+        <w:t>correspond</w:t>
+      </w:r>
+      <w:r>
+        <w:rPr>
+          <w:rFonts w:ascii="Times New Roman" w:hAnsi="Times New Roman" w:cs="Times New Roman"/>
+        </w:rPr>
+        <w:t xml:space="preserve">ía </w:t>
+      </w:r>
+      <w:r>
+        <w:rPr>
+          <w:rFonts w:ascii="Times New Roman" w:hAnsi="Times New Roman" w:cs="Times New Roman"/>
+        </w:rPr>
+        <w:t>al nivel de satisfacción con la salud, por ser las variables necesarias para responder la pregunta analítica.</w:t>
+      </w:r>
+      <w:r>
+        <w:rPr>
+          <w:rFonts w:ascii="Times New Roman" w:hAnsi="Times New Roman" w:cs="Times New Roman"/>
+        </w:rPr>
+        <w:t xml:space="preserve"> </w:t>
+      </w:r>
+      <w:r>
+        <w:rPr>
+          <w:rFonts w:ascii="Times New Roman" w:hAnsi="Times New Roman" w:cs="Times New Roman"/>
+        </w:rPr>
+        <w:t xml:space="preserve">Después se decidió conservar únicamente a las personas de 18 años o más, obteniendo una muestra de 172.025 registros. Inicialmente </w:t>
+      </w:r>
+      <w:r>
+        <w:rPr>
+          <w:rFonts w:ascii="Times New Roman" w:hAnsi="Times New Roman" w:cs="Times New Roman"/>
+        </w:rPr>
+        <w:t xml:space="preserve">exploramos </w:t>
+      </w:r>
+      <w:r>
+        <w:rPr>
+          <w:rFonts w:ascii="Times New Roman" w:hAnsi="Times New Roman" w:cs="Times New Roman"/>
+        </w:rPr>
+        <w:t xml:space="preserve">P753S2 para realizar el filtro geográfico, pero </w:t>
+      </w:r>
+      <w:r>
+        <w:rPr>
+          <w:rFonts w:ascii="Times New Roman" w:hAnsi="Times New Roman" w:cs="Times New Roman"/>
+        </w:rPr>
+        <w:t>se</w:t>
+      </w:r>
+      <w:r>
+        <w:rPr>
+          <w:rFonts w:ascii="Times New Roman" w:hAnsi="Times New Roman" w:cs="Times New Roman"/>
+        </w:rPr>
+        <w:t xml:space="preserve"> reducía la muestra a aproximadamente 253 observaciones. Siguiendo la aclaración del profesor, se decidió no aplicar </w:t>
+      </w:r>
+      <w:r>
+        <w:rPr>
+          <w:rFonts w:ascii="Times New Roman" w:hAnsi="Times New Roman" w:cs="Times New Roman"/>
+        </w:rPr>
+        <w:t>el</w:t>
+      </w:r>
+      <w:r>
+        <w:rPr>
+          <w:rFonts w:ascii="Times New Roman" w:hAnsi="Times New Roman" w:cs="Times New Roman"/>
+        </w:rPr>
+        <w:t xml:space="preserve"> filtro y trabajar solamente con el criterio de edad.</w:t>
+      </w:r>
+      <w:r>
+        <w:rPr>
+          <w:rFonts w:ascii="Times New Roman" w:hAnsi="Times New Roman" w:cs="Times New Roman"/>
+        </w:rPr>
+        <w:t xml:space="preserve"> </w:t>
+      </w:r>
+      <w:r>
+        <w:rPr>
+          <w:rFonts w:ascii="Times New Roman" w:hAnsi="Times New Roman" w:cs="Times New Roman"/>
+        </w:rPr>
+        <w:t xml:space="preserve">También </w:t>
+      </w:r>
+      <w:proofErr w:type="spellStart"/>
+      <w:r>
+        <w:rPr>
+          <w:rFonts w:ascii="Times New Roman" w:hAnsi="Times New Roman" w:cs="Times New Roman"/>
+        </w:rPr>
+        <w:t>evalumos</w:t>
+      </w:r>
+      <w:proofErr w:type="spellEnd"/>
+      <w:r>
+        <w:rPr>
+          <w:rFonts w:ascii="Times New Roman" w:hAnsi="Times New Roman" w:cs="Times New Roman"/>
+        </w:rPr>
+        <w:t xml:space="preserve"> </w:t>
+      </w:r>
+      <w:r>
+        <w:rPr>
+          <w:rFonts w:ascii="Times New Roman" w:hAnsi="Times New Roman" w:cs="Times New Roman"/>
+        </w:rPr>
+        <w:t>la calidad de las variables seleccionadas y se encontró que no presentaban valores faltantes y que sus valores estaban dentro de los rangos esperados. Por es</w:t>
+      </w:r>
+      <w:r>
+        <w:rPr>
+          <w:rFonts w:ascii="Times New Roman" w:hAnsi="Times New Roman" w:cs="Times New Roman"/>
+        </w:rPr>
+        <w:t xml:space="preserve">o </w:t>
+      </w:r>
+      <w:r>
+        <w:rPr>
+          <w:rFonts w:ascii="Times New Roman" w:hAnsi="Times New Roman" w:cs="Times New Roman"/>
+        </w:rPr>
+        <w:t>no fue necesario eliminar registros ni realizar imputaciones.</w:t>
+      </w:r>
+    </w:p>
+    <w:p>
+      <w:pPr>
+        <w:spacing w:line="360" w:lineRule="auto"/>
+        <w:rPr>
+          <w:rFonts w:ascii="Times New Roman" w:hAnsi="Times New Roman" w:cs="Times New Roman"/>
+        </w:rPr>
+      </w:pPr>
+      <w:r>
+        <w:rPr>
+          <w:rFonts w:ascii="Times New Roman" w:hAnsi="Times New Roman" w:cs="Times New Roman"/>
+        </w:rPr>
+        <w:t>Estas decisiones permitieron conservar una muestra amplia para realizar el análisis descriptivo, pero también definieron el alcance de las conclusiones</w:t>
+      </w:r>
+      <w:r>
+        <w:rPr>
+          <w:rFonts w:ascii="Times New Roman" w:hAnsi="Times New Roman" w:cs="Times New Roman"/>
+        </w:rPr>
+        <w:t>, l</w:t>
+      </w:r>
+      <w:r>
+        <w:rPr>
+          <w:rFonts w:ascii="Times New Roman" w:hAnsi="Times New Roman" w:cs="Times New Roman"/>
+        </w:rPr>
+        <w:t>os resultados permiten estudiar la relación entre edad y satisfacción con la salud dentro de la muestra adulta analizada, pero no establecer causalidad ni hacer afirmaciones exclusivamente sobre la población</w:t>
+      </w:r>
+      <w:r>
+        <w:rPr>
+          <w:rFonts w:ascii="Times New Roman" w:hAnsi="Times New Roman" w:cs="Times New Roman"/>
+        </w:rPr>
+        <w:t xml:space="preserve"> de</w:t>
+      </w:r>
+      <w:r>
+        <w:rPr>
+          <w:rFonts w:ascii="Times New Roman" w:hAnsi="Times New Roman" w:cs="Times New Roman"/>
+        </w:rPr>
+        <w:t xml:space="preserve"> Bogotá</w:t>
+      </w:r>
+      <w:r>
+        <w:rPr>
+          <w:rFonts w:ascii="Times New Roman" w:hAnsi="Times New Roman" w:cs="Times New Roman"/>
+        </w:rPr>
+        <w:t xml:space="preserve"> por los filtros dados</w:t>
+      </w:r>
+      <w:r>
+        <w:rPr>
+          <w:rFonts w:ascii="Times New Roman" w:hAnsi="Times New Roman" w:cs="Times New Roman"/>
+        </w:rPr>
+        <w:t>.</w:t>
+      </w:r>
     </w:p>
     <w:sectPr>
       <w:pgSz w:w="12240" w:h="15840"/>
@@ -3167,7 +3585,7 @@
 </file>
 
 <file path=word/numbering.xml><?xml version="1.0" encoding="utf-8"?>
-<w:numbering xmlns:wpc="http://schemas.microsoft.com/office/word/2010/wordprocessingCanvas" xmlns:cx="http://schemas.microsoft.com/office/drawing/2014/chartex" xmlns:cx1="http://schemas.microsoft.com/office/drawing/2015/9/8/chartex" xmlns:cx2="http://schemas.microsoft.com/office/drawing/2015/10/21/chartex" xmlns:cx3="http://schemas.microsoft.com/office/drawing/2016/5/9/chartex" xmlns:cx4="http://schemas.microsoft.com/office/drawing/2016/5/10/chartex" xmlns:cx5="http://schemas.microsoft.com/office/drawing/2016/5/11/chartex" xmlns:cx6="http://schemas.microsoft.com/office/drawing/2016/5/12/chartex" xmlns:cx7="http://schemas.microsoft.com/office/drawing/2016/5/13/chartex" xmlns:cx8="http://schemas.microsoft.com/office/drawing/2016/5/14/chartex" xmlns:mc="http://schemas.openxmlformats.org/markup-compatibility/2006" xmlns:m="http://schemas.openxmlformats.org/officeDocument/2006/math" xmlns:aink="http://schemas.microsoft.com/office/drawing/2016/ink" xmlns:am3d="http://schemas.microsoft.com/office/drawing/2017/model3d" xmlns:oel="http://schemas.microsoft.com/office/2019/extlst" xmlns:r="http://schemas.openxmlformats.org/officeDocument/2006/relationships" xmlns:wp14="http://schemas.microsoft.com/office/word/2010/wordprocessingDrawing" xmlns:wp="http://schemas.openxmlformats.org/drawingml/2006/wordprocessingDrawing" xmlns:wpg="http://schemas.microsoft.com/office/word/2010/wordprocessingGroup" xmlns:wpi="http://schemas.microsoft.com/office/word/2010/wordprocessingInk" xmlns:wps="http://schemas.microsoft.com/office/word/2010/wordprocessingShape" xmlns:o="urn:schemas-microsoft-com:office:office" xmlns:v="urn:schemas-microsoft-com:vml" xmlns:w10="urn:schemas-microsoft-com:office:word" xmlns:w="http://schemas.openxmlformats.org/wordprocessingml/2006/main" xmlns:w14="http://schemas.microsoft.com/office/word/2010/wordml" xmlns:w15="http://schemas.microsoft.com/office/word/2012/wordml" xmlns:w16cex="http://schemas.microsoft.com/office/word/2018/wordml/cex" xmlns:w16cid="http://schemas.microsoft.com/office/word/2016/wordml/cid" xmlns:w16="http://schemas.microsoft.com/office/word/2018/wordml" xmlns:w16sdtdh="http://schemas.microsoft.com/office/word/2020/wordml/sdtdatahash" xmlns:w16sdtfl="http://schemas.microsoft.com/office/word/2024/wordml/sdtformatlock" xmlns:w16se="http://schemas.microsoft.com/office/word/2015/wordml/symex" xmlns:w16du="http://schemas.microsoft.com/office/word/2023/wordml/word16du" xmlns:wne="http://schemas.microsoft.com/office/word/2006/wordml" mc:Ignorable="w14 w15 w16se w16cid w16 w16cex w16sdtdh w16sdtfl w16du wp14">
+<w:numbering xmlns:wpc="http://schemas.microsoft.com/office/word/2010/wordprocessingCanvas" xmlns:cx="http://schemas.microsoft.com/office/drawing/2014/chartex" xmlns:cx1="http://schemas.microsoft.com/office/drawing/2015/9/8/chartex" xmlns:cx2="http://schemas.microsoft.com/office/drawing/2015/10/21/chartex" xmlns:cx3="http://schemas.microsoft.com/office/drawing/2016/5/9/chartex" xmlns:cx4="http://schemas.microsoft.com/office/drawing/2016/5/10/chartex" xmlns:cx5="http://schemas.microsoft.com/office/drawing/2016/5/11/chartex" xmlns:cx6="http://schemas.microsoft.com/office/drawing/2016/5/12/chartex" xmlns:cx7="http://schemas.microsoft.com/office/drawing/2016/5/13/chartex" xmlns:cx8="http://schemas.microsoft.com/office/drawing/2016/5/14/chartex" xmlns:mc="http://schemas.openxmlformats.org/markup-compatibility/2006" xmlns:aink="http://schemas.microsoft.com/office/drawing/2016/ink" xmlns:am3d="http://schemas.microsoft.com/office/drawing/2017/model3d" xmlns:o="urn:schemas-microsoft-com:office:office" xmlns:oel="http://schemas.microsoft.com/office/2019/extlst" xmlns:r="http://schemas.openxmlformats.org/officeDocument/2006/relationships" xmlns:m="http://schemas.openxmlformats.org/officeDocument/2006/math" xmlns:v="urn:schemas-microsoft-com:vml" xmlns:wp14="http://schemas.microsoft.com/office/word/2010/wordprocessingDrawing" xmlns:wp="http://schemas.openxmlformats.org/drawingml/2006/wordprocessingDrawing" xmlns:w10="urn:schemas-microsoft-com:office:word" xmlns:w="http://schemas.openxmlformats.org/wordprocessingml/2006/main" xmlns:w14="http://schemas.microsoft.com/office/word/2010/wordml" xmlns:w15="http://schemas.microsoft.com/office/word/2012/wordml" xmlns:w16cex="http://schemas.microsoft.com/office/word/2018/wordml/cex" xmlns:w16cid="http://schemas.microsoft.com/office/word/2016/wordml/cid" xmlns:w16="http://schemas.microsoft.com/office/word/2018/wordml" xmlns:w16du="http://schemas.microsoft.com/office/word/2023/wordml/word16du" xmlns:w16sdtdh="http://schemas.microsoft.com/office/word/2020/wordml/sdtdatahash" xmlns:w16sdtfl="http://schemas.microsoft.com/office/word/2024/wordml/sdtformatlock" xmlns:w16se="http://schemas.microsoft.com/office/word/2015/wordml/symex" xmlns:wpg="http://schemas.microsoft.com/office/word/2010/wordprocessingGroup" xmlns:wpi="http://schemas.microsoft.com/office/word/2010/wordprocessingInk" xmlns:wne="http://schemas.microsoft.com/office/word/2006/wordml" xmlns:wps="http://schemas.microsoft.com/office/word/2010/wordprocessingShape" mc:Ignorable="w14 w15 w16se w16cid w16 w16cex w16sdtdh w16sdtfl w16du wp14">
   <w:abstractNum w:abstractNumId="0" w15:restartNumberingAfterBreak="0">
     <w:nsid w:val="24062CCA"/>
     <w:multiLevelType w:val="hybridMultilevel"/>
@@ -3786,7 +4204,7 @@
 </file>
 
 <file path=word/styles.xml><?xml version="1.0" encoding="utf-8"?>
-<w:styles xmlns:mc="http://schemas.openxmlformats.org/markup-compatibility/2006" xmlns:r="http://schemas.openxmlformats.org/officeDocument/2006/relationships" xmlns:w="http://schemas.openxmlformats.org/wordprocessingml/2006/main" xmlns:w14="http://schemas.microsoft.com/office/word/2010/wordml" xmlns:w15="http://schemas.microsoft.com/office/word/2012/wordml" xmlns:w16cex="http://schemas.microsoft.com/office/word/2018/wordml/cex" xmlns:w16cid="http://schemas.microsoft.com/office/word/2016/wordml/cid" xmlns:w16="http://schemas.microsoft.com/office/word/2018/wordml" xmlns:w16sdtdh="http://schemas.microsoft.com/office/word/2020/wordml/sdtdatahash" xmlns:w16sdtfl="http://schemas.microsoft.com/office/word/2024/wordml/sdtformatlock" xmlns:w16se="http://schemas.microsoft.com/office/word/2015/wordml/symex" xmlns:w16du="http://schemas.microsoft.com/office/word/2023/wordml/word16du" mc:Ignorable="w14 w15 w16se w16cid w16 w16cex w16sdtdh w16sdtfl w16du">
+<w:styles xmlns:mc="http://schemas.openxmlformats.org/markup-compatibility/2006" xmlns:r="http://schemas.openxmlformats.org/officeDocument/2006/relationships" xmlns:w="http://schemas.openxmlformats.org/wordprocessingml/2006/main" xmlns:w14="http://schemas.microsoft.com/office/word/2010/wordml" xmlns:w15="http://schemas.microsoft.com/office/word/2012/wordml" xmlns:w16cex="http://schemas.microsoft.com/office/word/2018/wordml/cex" xmlns:w16cid="http://schemas.microsoft.com/office/word/2016/wordml/cid" xmlns:w16="http://schemas.microsoft.com/office/word/2018/wordml" xmlns:w16du="http://schemas.microsoft.com/office/word/2023/wordml/word16du" xmlns:w16sdtdh="http://schemas.microsoft.com/office/word/2020/wordml/sdtdatahash" xmlns:w16sdtfl="http://schemas.microsoft.com/office/word/2024/wordml/sdtformatlock" xmlns:w16se="http://schemas.microsoft.com/office/word/2015/wordml/symex" mc:Ignorable="w14 w15 w16se w16cid w16 w16cex w16sdtdh w16sdtfl w16du">
   <w:docDefaults>
     <w:rPrDefault>
       <w:rPr>
@@ -4389,7 +4807,6 @@
   <w:style w:type="character" w:default="1" w:styleId="DefaultParagraphFont">
     <w:name w:val="Default Paragraph Font"/>
     <w:uiPriority w:val="1"/>
-    <w:semiHidden/>
     <w:unhideWhenUsed/>
   </w:style>
   <w:style w:type="table" w:default="1" w:styleId="TableNormal">

</xml_diff>